<commit_message>
Documentos y README alineados con la versión simplificada (sin Context API ni herramientas fuera de la materia)
- ERS 2.1: estado compartido en App por props, Google Fonts, BrowserRouter simple
- Cobertura: 15/15, 67,6 % sentencias, 59,1 % ramas, 69,0 % funciones, 71,3 % líneas; mocks con jasmine.createSpy
- Guía de defensa y plan de 2 días actualizados

Co-Authored-By: Claude Opus 5.5 <noreply@anthropic.com>
Claude-Session: https://claude.ai/code/session_01Pt6gjuLf4CGXtN9zPMw67H
</commit_message>
<xml_diff>
--- a/docs/Cobertura_Testing_ForeverInk.docx
+++ b/docs/Cobertura_Testing_ForeverInk.docx
@@ -161,7 +161,7 @@
         <w:rPr>
           <w:rFonts w:ascii="Arial" w:cs="Arial" w:eastAsia="Arial" w:hAnsi="Arial"/>
         </w:rPr>
-        <w:t>El proyecto tiene 15 pruebas: 10 de defensa (test/defensa.spec.jsx), que siguen la propuesta de pruebas del Anexo 1 (renderizado correcto, renderizado condicional, props, estado y eventos) y los conceptos de las guías 2.3.2 y 2.3.5 (hook personalizado, mocks y rutas protegidas), y 5 complementarias (test/complementarias.spec.jsx) que verifican el CRUD del archivo de datos, el flujo de compra aprobada, todas las vistas, la protección contra XSS y el manejo de errores.</w:t>
+        <w:t>El proyecto tiene 15 pruebas: 10 de defensa (test/defensa.spec.jsx), que siguen la propuesta de pruebas del Anexo 1 (renderizado correcto, renderizado condicional, props, estado y eventos) y los conceptos de las guías 2.3.2 y 2.3.5 y de la clase React IV (hook personalizado, mocks y rutas con MemoryRouter), y 5 complementarias (test/complementarias.spec.jsx) que verifican el CRUD del archivo de datos, el flujo de compra aprobada, todas las vistas, la protección contra XSS y el manejo de errores.</w:t>
       </w:r>
     </w:p>
     <w:p>
@@ -454,7 +454,7 @@
                 <w:sz w:val="19"/>
                 <w:szCs w:val="19"/>
               </w:rPr>
-              <w:t>80,8 % de sentencias en los 18 archivos que las pruebas tienen como objetivo (sección 4.2)</w:t>
+              <w:t>80,6 % de sentencias en los 18 archivos que las pruebas tienen como objetivo (sección 4.2)</w:t>
             </w:r>
           </w:p>
         </w:tc>
@@ -519,7 +519,7 @@
                 <w:sz w:val="19"/>
                 <w:szCs w:val="19"/>
               </w:rPr>
-              <w:t>68,9 % (794 de 1152) sobre todo src/</w:t>
+              <w:t>67,6 % (737 de 1091) sobre todo src/</w:t>
             </w:r>
           </w:p>
         </w:tc>
@@ -584,7 +584,7 @@
                 <w:sz w:val="19"/>
                 <w:szCs w:val="19"/>
               </w:rPr>
-              <w:t>58,8 %</w:t>
+              <w:t>59,1 %</w:t>
             </w:r>
           </w:p>
         </w:tc>
@@ -649,7 +649,7 @@
                 <w:sz w:val="19"/>
                 <w:szCs w:val="19"/>
               </w:rPr>
-              <w:t>69,4 %</w:t>
+              <w:t>69,0 %</w:t>
             </w:r>
           </w:p>
         </w:tc>
@@ -714,7 +714,7 @@
                 <w:sz w:val="19"/>
                 <w:szCs w:val="19"/>
               </w:rPr>
-              <w:t>72,9 %</w:t>
+              <w:t>71,3 %</w:t>
             </w:r>
           </w:p>
         </w:tc>
@@ -945,7 +945,7 @@
                 <w:sz w:val="19"/>
                 <w:szCs w:val="19"/>
               </w:rPr>
-              <w:t>Marco de pruebas: describe, it, expect, beforeEach, spyOn, jasmine.createSpy y jasmine.createSpyObj.</w:t>
+              <w:t>Marco de pruebas: describe, it, expect, beforeEach, afterEach, jasmine.createSpy y jasmine.createSpyObj. Comprobaciones con toBe, toBeTruthy, toContain y not (como en React IV).</w:t>
             </w:r>
           </w:p>
         </w:tc>
@@ -1179,7 +1179,7 @@
                 <w:sz w:val="19"/>
                 <w:szCs w:val="19"/>
               </w:rPr>
-              <w:t>@testing-library/react y jasmine-dom</w:t>
+              <w:t>@testing-library/react</w:t>
             </w:r>
           </w:p>
         </w:tc>
@@ -1209,72 +1209,7 @@
                 <w:sz w:val="19"/>
                 <w:szCs w:val="19"/>
               </w:rPr>
-              <w:t>Dibuja componentes (render), prueba hooks (renderHook y act), simula eventos (fireEvent) y agrega matchers como toBeInTheDocument, toHaveValue y toHaveAttribute, iguales a los de la guía 2.3.2.</w:t>
-            </w:r>
-          </w:p>
-        </w:tc>
-      </w:tr>
-      <w:tr>
-        <w:trPr>
-          <w:cantSplit/>
-        </w:trPr>
-        <w:tc>
-          <w:tcPr>
-            <w:tcW w:type="dxa" w:w="2600"/>
-            <w:tcBorders>
-              <w:top w:val="single" w:color="BFBFBF" w:sz="4"/>
-              <w:left w:val="single" w:color="BFBFBF" w:sz="4"/>
-              <w:bottom w:val="single" w:color="BFBFBF" w:sz="4"/>
-              <w:right w:val="single" w:color="BFBFBF" w:sz="4"/>
-            </w:tcBorders>
-            <w:tcMar>
-              <w:top w:type="dxa" w:w="60"/>
-              <w:left w:type="dxa" w:w="100"/>
-              <w:bottom w:type="dxa" w:w="60"/>
-              <w:right w:type="dxa" w:w="100"/>
-            </w:tcMar>
-          </w:tcPr>
-          <w:p>
-            <w:pPr>
-              <w:spacing w:after="20" w:line="252"/>
-            </w:pPr>
-            <w:r>
-              <w:rPr>
-                <w:rFonts w:ascii="Arial" w:cs="Arial" w:eastAsia="Arial" w:hAnsi="Arial"/>
-                <w:sz w:val="19"/>
-                <w:szCs w:val="19"/>
-              </w:rPr>
-              <w:t>babel-plugin-transform-vite-meta-glob</w:t>
-            </w:r>
-          </w:p>
-        </w:tc>
-        <w:tc>
-          <w:tcPr>
-            <w:tcW w:type="dxa" w:w="6760"/>
-            <w:tcBorders>
-              <w:top w:val="single" w:color="BFBFBF" w:sz="4"/>
-              <w:left w:val="single" w:color="BFBFBF" w:sz="4"/>
-              <w:bottom w:val="single" w:color="BFBFBF" w:sz="4"/>
-              <w:right w:val="single" w:color="BFBFBF" w:sz="4"/>
-            </w:tcBorders>
-            <w:tcMar>
-              <w:top w:type="dxa" w:w="60"/>
-              <w:left w:type="dxa" w:w="100"/>
-              <w:bottom w:type="dxa" w:w="60"/>
-              <w:right w:type="dxa" w:w="100"/>
-            </w:tcMar>
-          </w:tcPr>
-          <w:p>
-            <w:pPr>
-              <w:spacing w:after="20" w:line="252"/>
-            </w:pPr>
-            <w:r>
-              <w:rPr>
-                <w:rFonts w:ascii="Arial" w:cs="Arial" w:eastAsia="Arial" w:hAnsi="Arial"/>
-                <w:sz w:val="19"/>
-                <w:szCs w:val="19"/>
-              </w:rPr>
-              <w:t>Traduce import.meta.glob (usado en src/assets/images.js) para que webpack pueda compilar las imágenes en las pruebas.</w:t>
+              <w:t>Dibuja componentes (render), prueba hooks (renderHook y act), simula eventos (fireEvent), espera cambios asíncronos (waitFor) y, junto a MemoryRouter, simula rutas sin navegador (React IV).</w:t>
             </w:r>
           </w:p>
         </w:tc>
@@ -1339,7 +1274,7 @@
         <w:rPr>
           <w:rFonts w:ascii="Arial" w:cs="Arial" w:eastAsia="Arial" w:hAnsi="Arial"/>
         </w:rPr>
-        <w:t xml:space="preserve">: agrega los matchers de jasmine-dom, carga las pruebas y </w:t>
+        <w:t xml:space="preserve">: carga las pruebas y </w:t>
       </w:r>
       <w:r>
         <w:rPr>
@@ -1402,7 +1337,7 @@
           <w:szCs w:val="20"/>
           <w:shd w:fill="EFEFEF" w:val="clear"/>
         </w:rPr>
-        <w:t>renderConContextos</w:t>
+        <w:t>renderConRouter</w:t>
       </w:r>
       <w:r>
         <w:rPr>
@@ -1423,7 +1358,7 @@
         <w:rPr>
           <w:rFonts w:ascii="Arial" w:cs="Arial" w:eastAsia="Arial" w:hAnsi="Arial"/>
         </w:rPr>
-        <w:t xml:space="preserve"> (dibujan con MemoryRouter y los contextos), </w:t>
+        <w:t xml:space="preserve"> (dibujan dentro de MemoryRouter, como en React IV), </w:t>
       </w:r>
       <w:r>
         <w:rPr>
@@ -1540,23 +1475,7 @@
           <w:sz w:val="18"/>
           <w:szCs w:val="18"/>
         </w:rPr>
-        <w:t>npm test                # corre las 15 pruebas y genera coverage/</w:t>
-      </w:r>
-    </w:p>
-    <w:p>
-      <w:pPr>
-        <w:keepLines/>
-        <w:shd w:fill="F4F4F4" w:val="clear"/>
-        <w:spacing w:after="0" w:line="252"/>
-        <w:ind w:left="120" w:right="120"/>
-      </w:pPr>
-      <w:r>
-        <w:rPr>
-          <w:rFonts w:ascii="Consolas" w:cs="Consolas" w:eastAsia="Consolas" w:hAnsi="Consolas"/>
-          <w:sz w:val="18"/>
-          <w:szCs w:val="18"/>
-        </w:rPr>
-        <w:t>npm run test:defensa    # solo las 10 de defensa, con su nombre</w:t>
+        <w:t>npm test        # corre las 15 pruebas y genera coverage/</w:t>
       </w:r>
     </w:p>
     <w:p>
@@ -1696,7 +1615,7 @@
         <w:rPr>
           <w:rFonts w:ascii="Arial" w:cs="Arial" w:eastAsia="Arial" w:hAnsi="Arial"/>
         </w:rPr>
-        <w:t xml:space="preserve"> la pasarela de pago se reemplaza con </w:t>
+        <w:t xml:space="preserve"> como en el ejemplo de mocking de la guía 2.3.5, la pasarela de pago se reemplaza por </w:t>
       </w:r>
       <w:r>
         <w:rPr>
@@ -1705,13 +1624,28 @@
           <w:szCs w:val="20"/>
           <w:shd w:fill="EFEFEF" w:val="clear"/>
         </w:rPr>
-        <w:t>spyOn(pagosService, "procesar")</w:t>
+        <w:t>jasmine.createSpy("procesar").and.returnValue(...)</w:t>
       </w:r>
       <w:r>
         <w:rPr>
           <w:rFonts w:ascii="Arial" w:cs="Arial" w:eastAsia="Arial" w:hAnsi="Arial"/>
         </w:rPr>
-        <w:t xml:space="preserve"> para simular un pago rechazado (prueba 8) o aprobado (prueba 12) sin esperas ni servicios externos; el servicio de sesión se simula con </w:t>
+        <w:t xml:space="preserve"> para simular un pago rechazado (prueba 8) o aprobado (prueba 12), y en </w:t>
+      </w:r>
+      <w:r>
+        <w:rPr>
+          <w:rFonts w:ascii="Consolas" w:cs="Consolas" w:eastAsia="Consolas" w:hAnsi="Consolas"/>
+          <w:sz w:val="20"/>
+          <w:szCs w:val="20"/>
+          <w:shd w:fill="EFEFEF" w:val="clear"/>
+        </w:rPr>
+        <w:t>afterEach</w:t>
+      </w:r>
+      <w:r>
+        <w:rPr>
+          <w:rFonts w:ascii="Arial" w:cs="Arial" w:eastAsia="Arial" w:hAnsi="Arial"/>
+        </w:rPr>
+        <w:t xml:space="preserve"> se devuelve la función real. El servicio de sesión se simula con </w:t>
       </w:r>
       <w:r>
         <w:rPr>
@@ -1726,7 +1660,7 @@
         <w:rPr>
           <w:rFonts w:ascii="Arial" w:cs="Arial" w:eastAsia="Arial" w:hAnsi="Arial"/>
         </w:rPr>
-        <w:t xml:space="preserve"> (prueba 7), como en la guía 2.3.2.</w:t>
+        <w:t xml:space="preserve"> (prueba 7, guía 2.3.2).</w:t>
       </w:r>
     </w:p>
     <w:p>
@@ -3211,7 +3145,7 @@
                 <w:sz w:val="16"/>
                 <w:szCs w:val="16"/>
               </w:rPr>
-              <w:t>Mock (spyOn) + integración</w:t>
+              <w:t>Mock (createSpy) + integración</w:t>
             </w:r>
           </w:p>
         </w:tc>
@@ -3523,7 +3457,7 @@
                 <w:sz w:val="16"/>
                 <w:szCs w:val="16"/>
               </w:rPr>
-              <w:t>Contexto + rutas</w:t>
+              <w:t>Rutas (MemoryRouter)</w:t>
             </w:r>
           </w:p>
         </w:tc>
@@ -4655,7 +4589,7 @@
                 <w:sz w:val="16"/>
                 <w:szCs w:val="16"/>
               </w:rPr>
-              <w:t>25/25 (100,0 %)</w:t>
+              <w:t>42/69 (60,9 %)</w:t>
             </w:r>
           </w:p>
         </w:tc>
@@ -4685,7 +4619,7 @@
                 <w:sz w:val="16"/>
                 <w:szCs w:val="16"/>
               </w:rPr>
-              <w:t>0/0 (100,0 %)</w:t>
+              <w:t>0/6 (0,0 %)</w:t>
             </w:r>
           </w:p>
         </w:tc>
@@ -4715,7 +4649,7 @@
                 <w:sz w:val="16"/>
                 <w:szCs w:val="16"/>
               </w:rPr>
-              <w:t>12/12 (100,0 %)</w:t>
+              <w:t>17/30 (56,7 %)</w:t>
             </w:r>
           </w:p>
         </w:tc>
@@ -4745,7 +4679,7 @@
                 <w:sz w:val="16"/>
                 <w:szCs w:val="16"/>
               </w:rPr>
-              <w:t>14/14 (100,0 %)</w:t>
+              <w:t>28/49 (57,1 %)</w:t>
             </w:r>
           </w:p>
         </w:tc>
@@ -4810,7 +4744,7 @@
                 <w:sz w:val="16"/>
                 <w:szCs w:val="16"/>
               </w:rPr>
-              <w:t>5/5 (100,0 %)</w:t>
+              <w:t>1/1 (100,0 %)</w:t>
             </w:r>
           </w:p>
         </w:tc>
@@ -4900,7 +4834,7 @@
                 <w:sz w:val="16"/>
                 <w:szCs w:val="16"/>
               </w:rPr>
-              <w:t>5/5 (100,0 %)</w:t>
+              <w:t>1/1 (100,0 %)</w:t>
             </w:r>
           </w:p>
         </w:tc>
@@ -5120,7 +5054,7 @@
                 <w:sz w:val="16"/>
                 <w:szCs w:val="16"/>
               </w:rPr>
-              <w:t>33/41 (80,5 %)</w:t>
+              <w:t>32/40 (80,0 %)</w:t>
             </w:r>
           </w:p>
         </w:tc>
@@ -5210,7 +5144,7 @@
                 <w:sz w:val="16"/>
                 <w:szCs w:val="16"/>
               </w:rPr>
-              <w:t>32/37 (86,5 %)</w:t>
+              <w:t>31/36 (86,1 %)</w:t>
             </w:r>
           </w:p>
         </w:tc>
@@ -5275,7 +5209,7 @@
                 <w:sz w:val="16"/>
                 <w:szCs w:val="16"/>
               </w:rPr>
-              <w:t>91/139 (65,5 %)</w:t>
+              <w:t>89/139 (64,0 %)</w:t>
             </w:r>
           </w:p>
         </w:tc>
@@ -5305,7 +5239,7 @@
                 <w:sz w:val="16"/>
                 <w:szCs w:val="16"/>
               </w:rPr>
-              <w:t>93/138 (67,4 %)</w:t>
+              <w:t>93/140 (66,4 %)</w:t>
             </w:r>
           </w:p>
         </w:tc>
@@ -5335,7 +5269,7 @@
                 <w:sz w:val="16"/>
                 <w:szCs w:val="16"/>
               </w:rPr>
-              <w:t>40/62 (64,5 %)</w:t>
+              <w:t>40/64 (62,5 %)</w:t>
             </w:r>
           </w:p>
         </w:tc>
@@ -5365,7 +5299,7 @@
                 <w:sz w:val="16"/>
                 <w:szCs w:val="16"/>
               </w:rPr>
-              <w:t>83/124 (66,9 %)</w:t>
+              <w:t>81/124 (65,3 %)</w:t>
             </w:r>
           </w:p>
         </w:tc>
@@ -5430,7 +5364,7 @@
                 <w:sz w:val="16"/>
                 <w:szCs w:val="16"/>
               </w:rPr>
-              <w:t>6/8 (75,0 %)</w:t>
+              <w:t>5/7 (71,4 %)</w:t>
             </w:r>
           </w:p>
         </w:tc>
@@ -5520,7 +5454,7 @@
                 <w:sz w:val="16"/>
                 <w:szCs w:val="16"/>
               </w:rPr>
-              <w:t>6/8 (75,0 %)</w:t>
+              <w:t>5/7 (71,4 %)</w:t>
             </w:r>
           </w:p>
         </w:tc>
@@ -5585,7 +5519,7 @@
                 <w:sz w:val="16"/>
                 <w:szCs w:val="16"/>
               </w:rPr>
-              <w:t>18/18 (100,0 %)</w:t>
+              <w:t>17/17 (100,0 %)</w:t>
             </w:r>
           </w:p>
         </w:tc>
@@ -5675,7 +5609,7 @@
                 <w:sz w:val="16"/>
                 <w:szCs w:val="16"/>
               </w:rPr>
-              <w:t>18/18 (100,0 %)</w:t>
+              <w:t>17/17 (100,0 %)</w:t>
             </w:r>
           </w:p>
         </w:tc>
@@ -5865,7 +5799,7 @@
                 <w:sz w:val="16"/>
                 <w:szCs w:val="16"/>
               </w:rPr>
-              <w:t>context</w:t>
+              <w:t>data</w:t>
             </w:r>
           </w:p>
         </w:tc>
@@ -5895,7 +5829,7 @@
                 <w:sz w:val="16"/>
                 <w:szCs w:val="16"/>
               </w:rPr>
-              <w:t>37/65 (56,9 %)</w:t>
+              <w:t>69/76 (90,8 %)</w:t>
             </w:r>
           </w:p>
         </w:tc>
@@ -5925,7 +5859,7 @@
                 <w:sz w:val="16"/>
                 <w:szCs w:val="16"/>
               </w:rPr>
-              <w:t>3/14 (21,4 %)</w:t>
+              <w:t>19/27 (70,4 %)</w:t>
             </w:r>
           </w:p>
         </w:tc>
@@ -5955,7 +5889,7 @@
                 <w:sz w:val="16"/>
                 <w:szCs w:val="16"/>
               </w:rPr>
-              <w:t>13/29 (44,8 %)</w:t>
+              <w:t>26/27 (96,3 %)</w:t>
             </w:r>
           </w:p>
         </w:tc>
@@ -5985,7 +5919,7 @@
                 <w:sz w:val="16"/>
                 <w:szCs w:val="16"/>
               </w:rPr>
-              <w:t>33/52 (63,5 %)</w:t>
+              <w:t>56/62 (90,3 %)</w:t>
             </w:r>
           </w:p>
         </w:tc>
@@ -6020,7 +5954,7 @@
                 <w:sz w:val="16"/>
                 <w:szCs w:val="16"/>
               </w:rPr>
-              <w:t>data</w:t>
+              <w:t>hooks</w:t>
             </w:r>
           </w:p>
         </w:tc>
@@ -6050,7 +5984,7 @@
                 <w:sz w:val="16"/>
                 <w:szCs w:val="16"/>
               </w:rPr>
-              <w:t>69/76 (90,8 %)</w:t>
+              <w:t>22/28 (78,6 %)</w:t>
             </w:r>
           </w:p>
         </w:tc>
@@ -6080,7 +6014,7 @@
                 <w:sz w:val="16"/>
                 <w:szCs w:val="16"/>
               </w:rPr>
-              <w:t>19/27 (70,4 %)</w:t>
+              <w:t>5/7 (71,4 %)</w:t>
             </w:r>
           </w:p>
         </w:tc>
@@ -6110,7 +6044,7 @@
                 <w:sz w:val="16"/>
                 <w:szCs w:val="16"/>
               </w:rPr>
-              <w:t>26/27 (96,3 %)</w:t>
+              <w:t>7/10 (70,0 %)</w:t>
             </w:r>
           </w:p>
         </w:tc>
@@ -6140,7 +6074,7 @@
                 <w:sz w:val="16"/>
                 <w:szCs w:val="16"/>
               </w:rPr>
-              <w:t>56/62 (90,3 %)</w:t>
+              <w:t>19/24 (79,2 %)</w:t>
             </w:r>
           </w:p>
         </w:tc>
@@ -6175,7 +6109,7 @@
                 <w:sz w:val="16"/>
                 <w:szCs w:val="16"/>
               </w:rPr>
-              <w:t>hooks</w:t>
+              <w:t>pages/admin</w:t>
             </w:r>
           </w:p>
         </w:tc>
@@ -6205,7 +6139,7 @@
                 <w:sz w:val="16"/>
                 <w:szCs w:val="16"/>
               </w:rPr>
-              <w:t>25/36 (69,4 %)</w:t>
+              <w:t>74/138 (53,6 %)</w:t>
             </w:r>
           </w:p>
         </w:tc>
@@ -6235,7 +6169,7 @@
                 <w:sz w:val="16"/>
                 <w:szCs w:val="16"/>
               </w:rPr>
-              <w:t>5/10 (50,0 %)</w:t>
+              <w:t>58/114 (50,9 %)</w:t>
             </w:r>
           </w:p>
         </w:tc>
@@ -6265,7 +6199,7 @@
                 <w:sz w:val="16"/>
                 <w:szCs w:val="16"/>
               </w:rPr>
-              <w:t>8/12 (66,7 %)</w:t>
+              <w:t>25/48 (52,1 %)</w:t>
             </w:r>
           </w:p>
         </w:tc>
@@ -6295,7 +6229,7 @@
                 <w:sz w:val="16"/>
                 <w:szCs w:val="16"/>
               </w:rPr>
-              <w:t>22/31 (71,0 %)</w:t>
+              <w:t>71/125 (56,8 %)</w:t>
             </w:r>
           </w:p>
         </w:tc>
@@ -6330,7 +6264,7 @@
                 <w:sz w:val="16"/>
                 <w:szCs w:val="16"/>
               </w:rPr>
-              <w:t>pages/admin</w:t>
+              <w:t>pages/tienda</w:t>
             </w:r>
           </w:p>
         </w:tc>
@@ -6360,7 +6294,7 @@
                 <w:sz w:val="16"/>
                 <w:szCs w:val="16"/>
               </w:rPr>
-              <w:t>84/148 (56,8 %)</w:t>
+              <w:t>105/154 (68,2 %)</w:t>
             </w:r>
           </w:p>
         </w:tc>
@@ -6390,7 +6324,7 @@
                 <w:sz w:val="16"/>
                 <w:szCs w:val="16"/>
               </w:rPr>
-              <w:t>58/114 (50,9 %)</w:t>
+              <w:t>45/78 (57,7 %)</w:t>
             </w:r>
           </w:p>
         </w:tc>
@@ -6420,7 +6354,7 @@
                 <w:sz w:val="16"/>
                 <w:szCs w:val="16"/>
               </w:rPr>
-              <w:t>25/48 (52,1 %)</w:t>
+              <w:t>33/50 (66,0 %)</w:t>
             </w:r>
           </w:p>
         </w:tc>
@@ -6450,7 +6384,7 @@
                 <w:sz w:val="16"/>
                 <w:szCs w:val="16"/>
               </w:rPr>
-              <w:t>81/135 (60,0 %)</w:t>
+              <w:t>103/145 (71,0 %)</w:t>
             </w:r>
           </w:p>
         </w:tc>
@@ -6485,7 +6419,7 @@
                 <w:sz w:val="16"/>
                 <w:szCs w:val="16"/>
               </w:rPr>
-              <w:t>pages/tienda</w:t>
+              <w:t>services</w:t>
             </w:r>
           </w:p>
         </w:tc>
@@ -6515,7 +6449,7 @@
                 <w:sz w:val="16"/>
                 <w:szCs w:val="16"/>
               </w:rPr>
-              <w:t>120/169 (71,0 %)</w:t>
+              <w:t>146/250 (58,4 %)</w:t>
             </w:r>
           </w:p>
         </w:tc>
@@ -6545,7 +6479,7 @@
                 <w:sz w:val="16"/>
                 <w:szCs w:val="16"/>
               </w:rPr>
-              <w:t>45/78 (57,7 %)</w:t>
+              <w:t>66/178 (37,1 %)</w:t>
             </w:r>
           </w:p>
         </w:tc>
@@ -6575,7 +6509,7 @@
                 <w:sz w:val="16"/>
                 <w:szCs w:val="16"/>
               </w:rPr>
-              <w:t>34/51 (66,7 %)</w:t>
+              <w:t>77/116 (66,4 %)</w:t>
             </w:r>
           </w:p>
         </w:tc>
@@ -6605,7 +6539,7 @@
                 <w:sz w:val="16"/>
                 <w:szCs w:val="16"/>
               </w:rPr>
-              <w:t>117/159 (73,6 %)</w:t>
+              <w:t>128/202 (63,4 %)</w:t>
             </w:r>
           </w:p>
         </w:tc>
@@ -6640,7 +6574,7 @@
                 <w:sz w:val="16"/>
                 <w:szCs w:val="16"/>
               </w:rPr>
-              <w:t>services</w:t>
+              <w:t>utils</w:t>
             </w:r>
           </w:p>
         </w:tc>
@@ -6670,7 +6604,7 @@
                 <w:sz w:val="16"/>
                 <w:szCs w:val="16"/>
               </w:rPr>
-              <w:t>146/250 (58,4 %)</w:t>
+              <w:t>124/161 (77,0 %)</w:t>
             </w:r>
           </w:p>
         </w:tc>
@@ -6700,7 +6634,7 @@
                 <w:sz w:val="16"/>
                 <w:szCs w:val="16"/>
               </w:rPr>
-              <w:t>66/178 (37,1 %)</w:t>
+              <w:t>124/187 (66,3 %)</w:t>
             </w:r>
           </w:p>
         </w:tc>
@@ -6730,7 +6664,7 @@
                 <w:sz w:val="16"/>
                 <w:szCs w:val="16"/>
               </w:rPr>
-              <w:t>77/116 (66,4 %)</w:t>
+              <w:t>25/28 (89,3 %)</w:t>
             </w:r>
           </w:p>
         </w:tc>
@@ -6760,7 +6694,7 @@
                 <w:sz w:val="16"/>
                 <w:szCs w:val="16"/>
               </w:rPr>
-              <w:t>128/202 (63,4 %)</w:t>
+              <w:t>110/124 (88,7 %)</w:t>
             </w:r>
           </w:p>
         </w:tc>
@@ -6795,7 +6729,7 @@
                 <w:sz w:val="16"/>
                 <w:szCs w:val="16"/>
               </w:rPr>
-              <w:t>utils</w:t>
+              <w:t>TOTAL</w:t>
             </w:r>
           </w:p>
         </w:tc>
@@ -6825,7 +6759,7 @@
                 <w:sz w:val="16"/>
                 <w:szCs w:val="16"/>
               </w:rPr>
-              <w:t>124/161 (77,0 %)</w:t>
+              <w:t>737/1091 (67,6 %)</w:t>
             </w:r>
           </w:p>
         </w:tc>
@@ -6855,7 +6789,7 @@
                 <w:sz w:val="16"/>
                 <w:szCs w:val="16"/>
               </w:rPr>
-              <w:t>124/187 (66,3 %)</w:t>
+              <w:t>496/839 (59,1 %)</w:t>
             </w:r>
           </w:p>
         </w:tc>
@@ -6885,7 +6819,7 @@
                 <w:sz w:val="16"/>
                 <w:szCs w:val="16"/>
               </w:rPr>
-              <w:t>25/28 (89,3 %)</w:t>
+              <w:t>280/406 (69,0 %)</w:t>
             </w:r>
           </w:p>
         </w:tc>
@@ -6915,162 +6849,7 @@
                 <w:sz w:val="16"/>
                 <w:szCs w:val="16"/>
               </w:rPr>
-              <w:t>110/124 (88,7 %)</w:t>
-            </w:r>
-          </w:p>
-        </w:tc>
-      </w:tr>
-      <w:tr>
-        <w:trPr>
-          <w:cantSplit/>
-        </w:trPr>
-        <w:tc>
-          <w:tcPr>
-            <w:tcW w:type="dxa" w:w="2300"/>
-            <w:tcBorders>
-              <w:top w:val="single" w:color="BFBFBF" w:sz="4"/>
-              <w:left w:val="single" w:color="BFBFBF" w:sz="4"/>
-              <w:bottom w:val="single" w:color="BFBFBF" w:sz="4"/>
-              <w:right w:val="single" w:color="BFBFBF" w:sz="4"/>
-            </w:tcBorders>
-            <w:tcMar>
-              <w:top w:type="dxa" w:w="60"/>
-              <w:left w:type="dxa" w:w="100"/>
-              <w:bottom w:type="dxa" w:w="60"/>
-              <w:right w:type="dxa" w:w="100"/>
-            </w:tcMar>
-          </w:tcPr>
-          <w:p>
-            <w:pPr>
-              <w:spacing w:after="20" w:line="252"/>
-            </w:pPr>
-            <w:r>
-              <w:rPr>
-                <w:rFonts w:ascii="Arial" w:cs="Arial" w:eastAsia="Arial" w:hAnsi="Arial"/>
-                <w:sz w:val="16"/>
-                <w:szCs w:val="16"/>
-              </w:rPr>
-              <w:t>TOTAL</w:t>
-            </w:r>
-          </w:p>
-        </w:tc>
-        <w:tc>
-          <w:tcPr>
-            <w:tcW w:type="dxa" w:w="1760"/>
-            <w:tcBorders>
-              <w:top w:val="single" w:color="BFBFBF" w:sz="4"/>
-              <w:left w:val="single" w:color="BFBFBF" w:sz="4"/>
-              <w:bottom w:val="single" w:color="BFBFBF" w:sz="4"/>
-              <w:right w:val="single" w:color="BFBFBF" w:sz="4"/>
-            </w:tcBorders>
-            <w:tcMar>
-              <w:top w:type="dxa" w:w="60"/>
-              <w:left w:type="dxa" w:w="100"/>
-              <w:bottom w:type="dxa" w:w="60"/>
-              <w:right w:type="dxa" w:w="100"/>
-            </w:tcMar>
-          </w:tcPr>
-          <w:p>
-            <w:pPr>
-              <w:spacing w:after="20" w:line="252"/>
-            </w:pPr>
-            <w:r>
-              <w:rPr>
-                <w:rFonts w:ascii="Arial" w:cs="Arial" w:eastAsia="Arial" w:hAnsi="Arial"/>
-                <w:sz w:val="16"/>
-                <w:szCs w:val="16"/>
-              </w:rPr>
-              <w:t>794/1152 (68,9 %)</w:t>
-            </w:r>
-          </w:p>
-        </w:tc>
-        <w:tc>
-          <w:tcPr>
-            <w:tcW w:type="dxa" w:w="1760"/>
-            <w:tcBorders>
-              <w:top w:val="single" w:color="BFBFBF" w:sz="4"/>
-              <w:left w:val="single" w:color="BFBFBF" w:sz="4"/>
-              <w:bottom w:val="single" w:color="BFBFBF" w:sz="4"/>
-              <w:right w:val="single" w:color="BFBFBF" w:sz="4"/>
-            </w:tcBorders>
-            <w:tcMar>
-              <w:top w:type="dxa" w:w="60"/>
-              <w:left w:type="dxa" w:w="100"/>
-              <w:bottom w:type="dxa" w:w="60"/>
-              <w:right w:type="dxa" w:w="100"/>
-            </w:tcMar>
-          </w:tcPr>
-          <w:p>
-            <w:pPr>
-              <w:spacing w:after="20" w:line="252"/>
-            </w:pPr>
-            <w:r>
-              <w:rPr>
-                <w:rFonts w:ascii="Arial" w:cs="Arial" w:eastAsia="Arial" w:hAnsi="Arial"/>
-                <w:sz w:val="16"/>
-                <w:szCs w:val="16"/>
-              </w:rPr>
-              <w:t>499/848 (58,8 %)</w:t>
-            </w:r>
-          </w:p>
-        </w:tc>
-        <w:tc>
-          <w:tcPr>
-            <w:tcW w:type="dxa" w:w="1760"/>
-            <w:tcBorders>
-              <w:top w:val="single" w:color="BFBFBF" w:sz="4"/>
-              <w:left w:val="single" w:color="BFBFBF" w:sz="4"/>
-              <w:bottom w:val="single" w:color="BFBFBF" w:sz="4"/>
-              <w:right w:val="single" w:color="BFBFBF" w:sz="4"/>
-            </w:tcBorders>
-            <w:tcMar>
-              <w:top w:type="dxa" w:w="60"/>
-              <w:left w:type="dxa" w:w="100"/>
-              <w:bottom w:type="dxa" w:w="60"/>
-              <w:right w:type="dxa" w:w="100"/>
-            </w:tcMar>
-          </w:tcPr>
-          <w:p>
-            <w:pPr>
-              <w:spacing w:after="20" w:line="252"/>
-            </w:pPr>
-            <w:r>
-              <w:rPr>
-                <w:rFonts w:ascii="Arial" w:cs="Arial" w:eastAsia="Arial" w:hAnsi="Arial"/>
-                <w:sz w:val="16"/>
-                <w:szCs w:val="16"/>
-              </w:rPr>
-              <w:t>290/418 (69,4 %)</w:t>
-            </w:r>
-          </w:p>
-        </w:tc>
-        <w:tc>
-          <w:tcPr>
-            <w:tcW w:type="dxa" w:w="1780"/>
-            <w:tcBorders>
-              <w:top w:val="single" w:color="BFBFBF" w:sz="4"/>
-              <w:left w:val="single" w:color="BFBFBF" w:sz="4"/>
-              <w:bottom w:val="single" w:color="BFBFBF" w:sz="4"/>
-              <w:right w:val="single" w:color="BFBFBF" w:sz="4"/>
-            </w:tcBorders>
-            <w:tcMar>
-              <w:top w:type="dxa" w:w="60"/>
-              <w:left w:type="dxa" w:w="100"/>
-              <w:bottom w:type="dxa" w:w="60"/>
-              <w:right w:type="dxa" w:w="100"/>
-            </w:tcMar>
-          </w:tcPr>
-          <w:p>
-            <w:pPr>
-              <w:spacing w:after="20" w:line="252"/>
-            </w:pPr>
-            <w:r>
-              <w:rPr>
-                <w:rFonts w:ascii="Arial" w:cs="Arial" w:eastAsia="Arial" w:hAnsi="Arial"/>
-                <w:sz w:val="16"/>
-                <w:szCs w:val="16"/>
-              </w:rPr>
-              <w:t>716/982 (72,9 %)</w:t>
+              <w:t>661/927 (71,3 %)</w:t>
             </w:r>
           </w:p>
         </w:tc>
@@ -8578,7 +8357,7 @@
                 <w:sz w:val="15"/>
                 <w:szCs w:val="15"/>
               </w:rPr>
-              <w:t>7/7 (100,0 %)</w:t>
+              <w:t>6/6 (100,0 %)</w:t>
             </w:r>
           </w:p>
         </w:tc>
@@ -8668,7 +8447,7 @@
                 <w:sz w:val="15"/>
                 <w:szCs w:val="15"/>
               </w:rPr>
-              <w:t>7/7 (100,0 %)</w:t>
+              <w:t>6/6 (100,0 %)</w:t>
             </w:r>
           </w:p>
         </w:tc>
@@ -9198,7 +8977,7 @@
                 <w:sz w:val="15"/>
                 <w:szCs w:val="15"/>
               </w:rPr>
-              <w:t>33/37 (89,2 %)</w:t>
+              <w:t>32/36 (88,9 %)</w:t>
             </w:r>
           </w:p>
         </w:tc>
@@ -9288,7 +9067,7 @@
                 <w:sz w:val="15"/>
                 <w:szCs w:val="15"/>
               </w:rPr>
-              <w:t>31/34 (91,2 %)</w:t>
+              <w:t>30/33 (90,9 %)</w:t>
             </w:r>
           </w:p>
         </w:tc>
@@ -9353,7 +9132,7 @@
                 <w:sz w:val="15"/>
                 <w:szCs w:val="15"/>
               </w:rPr>
-              <w:t>26/27 (96,3 %)</w:t>
+              <w:t>25/26 (96,2 %)</w:t>
             </w:r>
           </w:p>
         </w:tc>
@@ -9413,7 +9192,7 @@
                 <w:sz w:val="15"/>
                 <w:szCs w:val="15"/>
               </w:rPr>
-              <w:t>12/12 (100,0 %)</w:t>
+              <w:t>11/11 (100,0 %)</w:t>
             </w:r>
           </w:p>
         </w:tc>
@@ -9443,7 +9222,7 @@
                 <w:sz w:val="15"/>
                 <w:szCs w:val="15"/>
               </w:rPr>
-              <w:t>20/20 (100,0 %)</w:t>
+              <w:t>19/19 (100,0 %)</w:t>
             </w:r>
           </w:p>
         </w:tc>
@@ -10128,7 +9907,7 @@
                 <w:sz w:val="15"/>
                 <w:szCs w:val="15"/>
               </w:rPr>
-              <w:t>315/390 (80,8 %)</w:t>
+              <w:t>312/387 (80,6 %)</w:t>
             </w:r>
           </w:p>
         </w:tc>
@@ -10188,7 +9967,7 @@
                 <w:sz w:val="15"/>
                 <w:szCs w:val="15"/>
               </w:rPr>
-              <w:t>100/116 (86,2 %)</w:t>
+              <w:t>99/115 (86,1 %)</w:t>
             </w:r>
           </w:p>
         </w:tc>
@@ -10218,7 +9997,7 @@
                 <w:sz w:val="15"/>
                 <w:szCs w:val="15"/>
               </w:rPr>
-              <w:t>276/321 (86,0 %)</w:t>
+              <w:t>273/318 (85,8 %)</w:t>
             </w:r>
           </w:p>
         </w:tc>
@@ -10249,7 +10028,7 @@
         <w:rPr>
           <w:rFonts w:ascii="Arial" w:cs="Arial" w:eastAsia="Arial" w:hAnsi="Arial"/>
         </w:rPr>
-        <w:t>Cómo leer las cifras (material 2.3.4): sentencias y líneas indican qué parte del código se ejecutó; ramas indica cuántos caminos de los if, ternarios y &amp;&amp; se recorrieron; funciones, cuántas funciones se llamaron al menos una vez. La cobertura global es de 68,9 % de sentencias, 58,8 % de ramas, 69,4 % de funciones y 72,9 % de líneas, con solo 15 pruebas.</w:t>
+        <w:t>Cómo leer las cifras (material 2.3.4): sentencias y líneas indican qué parte del código se ejecutó; ramas indica cuántos caminos de los if, ternarios y &amp;&amp; se recorrieron; funciones, cuántas funciones se llamaron al menos una vez. La cobertura global es de 67,6 % de sentencias, 59,1 % de ramas, 69,0 % de funciones y 71,3 % de líneas, con solo 15 pruebas.</w:t>
       </w:r>
     </w:p>
     <w:p>
@@ -10265,7 +10044,7 @@
         <w:rPr>
           <w:rFonts w:ascii="Arial" w:cs="Arial" w:eastAsia="Arial" w:hAnsi="Arial"/>
         </w:rPr>
-        <w:t>Las pruebas 8, 12 y 13 dibujan la aplicación completa con rutas y contextos. Por eso ejecutan también la navegación, las plantillas y los servicios, y explican que carpetas como components/utilidades y data superen el 90 %.</w:t>
+        <w:t>Las pruebas 8, 12 y 13 dibujan la aplicación completa con sus rutas. Por eso ejecutan también la navegación, las plantillas y los servicios, y explican que components/utilidades llegue al 100 % y data supere el 90 % de sentencias.</w:t>
       </w:r>
     </w:p>
     <w:p>
@@ -10281,7 +10060,7 @@
         <w:rPr>
           <w:rFonts w:ascii="Arial" w:cs="Arial" w:eastAsia="Arial" w:hAnsi="Arial"/>
         </w:rPr>
-        <w:t>En los 18 archivos objetivo la cobertura sube a 80,8 % de sentencias y 86,0 % de líneas. Lo que queda sin ejecutar son ramas alternativas: por ejemplo, el envío del formulario de contacto (la prueba 4 solo verifica el estado al escribir) o la lista vacía en ListaProductos.</w:t>
+        <w:t>En los 18 archivos objetivo la cobertura sube a 80,6 % de sentencias y 85,8 % de líneas. Lo que queda sin ejecutar son ramas alternativas: por ejemplo, el envío del formulario de contacto (la prueba 4 solo verifica el estado al escribir) o la lista vacía en ListaProductos.</w:t>
       </w:r>
     </w:p>
     <w:p>
@@ -10297,7 +10076,7 @@
         <w:rPr>
           <w:rFonts w:ascii="Arial" w:cs="Arial" w:eastAsia="Arial" w:hAnsi="Arial"/>
         </w:rPr>
-        <w:t>Las ramas más bajas están en services (37,1 %) y context (21,4 %): son caminos de error poco frecuentes (cupos agotados al pagar, almacenamiento bloqueado, ediciones desde el panel). Las vistas del panel sí se dibujan (prueba 13), pero sus formularios de edición no se envían en las pruebas.</w:t>
+        <w:t>Las ramas más bajas están en services (37,1 %) y pages/admin (50,9 %): son caminos de error poco frecuentes (cupos agotados al pagar, almacenamiento bloqueado) y ediciones desde el panel. Las vistas del panel sí se dibujan (prueba 13), pero sus formularios de edición no se envían en las pruebas.</w:t>
       </w:r>
     </w:p>
     <w:p>
@@ -10325,7 +10104,7 @@
         <w:rPr>
           <w:rFonts w:ascii="Arial" w:cs="Arial" w:eastAsia="Arial" w:hAnsi="Arial"/>
         </w:rPr>
-        <w:t>Las 15 pruebas pasan sin errores. Las 10 de defensa cubren cada tipo de la propuesta del Anexo 1 (renderizado, renderizado condicional, props, estado y eventos), además de un hook personalizado, mocks con createSpyObj y spyOn, lógica de validación y rutas protegidas.</w:t>
+        <w:t>Las 15 pruebas pasan sin errores. Las 10 de defensa cubren cada tipo de la propuesta del Anexo 1 (renderizado, renderizado condicional, props, estado y eventos), además de un hook personalizado, mocks con jasmine.createSpy y jasmine.createSpyObj, lógica de validación y rutas protegidas.</w:t>
       </w:r>
     </w:p>
     <w:p>

</xml_diff>

<commit_message>
Carpetas más simples: imágenes por tipo, estudio.js en data/, useFormulario en utils/ y sin archivos generados
- assets/images/ separado en disenos/, portadas/, blog/ y marca/
- config/estudio.js -> data/estudio.js; hooks/useFormulario.js -> utils/useFormulario.js
- dist/ y docs/informe-cobertura-html/ fuera del repo (se generan con npm run build y npm test)
- README y documentos con las rutas nuevas

Co-Authored-By: Claude Opus 5.5 <noreply@anthropic.com>
Claude-Session: https://claude.ai/code/session_01Pt6gjuLf4CGXtN9zPMw67H
</commit_message>
<xml_diff>
--- a/docs/Cobertura_Testing_ForeverInk.docx
+++ b/docs/Cobertura_Testing_ForeverInk.docx
@@ -1495,13 +1495,13 @@
           <w:szCs w:val="20"/>
           <w:shd w:fill="EFEFEF" w:val="clear"/>
         </w:rPr>
-        <w:t xml:space="preserve">coverage/html/index.html</w:t>
+        <w:t>coverage/html/index.html</w:t>
       </w:r>
       <w:r>
         <w:rPr>
           <w:rFonts w:ascii="Arial" w:cs="Arial" w:eastAsia="Arial" w:hAnsi="Arial"/>
         </w:rPr>
-        <w:t xml:space="preserve"> (copia en </w:t>
+        <w:t xml:space="preserve"> después de correr </w:t>
       </w:r>
       <w:r>
         <w:rPr>
@@ -1510,13 +1510,13 @@
           <w:szCs w:val="20"/>
           <w:shd w:fill="EFEFEF" w:val="clear"/>
         </w:rPr>
-        <w:t xml:space="preserve">docs/informe-cobertura-html</w:t>
+        <w:t>npm test</w:t>
       </w:r>
       <w:r>
         <w:rPr>
           <w:rFonts w:ascii="Arial" w:cs="Arial" w:eastAsia="Arial" w:hAnsi="Arial"/>
         </w:rPr>
-        <w:t xml:space="preserve">).</w:t>
+        <w:t>.</w:t>
       </w:r>
     </w:p>
     <w:p>
@@ -2894,7 +2894,7 @@
                 <w:szCs w:val="16"/>
                 <w:shd w:fill="EFEFEF" w:val="clear"/>
               </w:rPr>
-              <w:t>hooks/useFormulario.js</w:t>
+              <w:t>utils/useFormulario.js</w:t>
             </w:r>
           </w:p>
         </w:tc>
@@ -8172,7 +8172,7 @@
                 <w:sz w:val="15"/>
                 <w:szCs w:val="15"/>
               </w:rPr>
-              <w:t>hooks/useFormulario.js</w:t>
+              <w:t>utils/useFormulario.js</w:t>
             </w:r>
           </w:p>
         </w:tc>

</xml_diff>

<commit_message>
EP2 sin backend: main vuelve a la versión solo frontend
La Evaluación Parcial 2 no lleva backend. Se restaura el proyecto tal como
estaba antes de los microservicios (React + datos simulados en db.js,
15 pruebas Jasmine/Karma). La versión con los 3 microservicios Spring Boot
queda guardada en la rama entrega-3-microservicios para la tercera entrega.

Co-Authored-By: Claude Opus 5.5 <noreply@anthropic.com>
Claude-Session: https://claude.ai/code/session_01Pt6gjuLf4CGXtN9zPMw67H
</commit_message>
<xml_diff>
--- a/docs/Cobertura_Testing_ForeverInk.docx
+++ b/docs/Cobertura_Testing_ForeverInk.docx
@@ -161,7 +161,7 @@
         <w:rPr>
           <w:rFonts w:ascii="Arial" w:cs="Arial" w:eastAsia="Arial" w:hAnsi="Arial"/>
         </w:rPr>
-        <w:t>El proyecto tiene 15 pruebas: 10 de defensa (test/defensa.spec.jsx), que siguen la propuesta de pruebas del Anexo 1 (renderizado correcto, renderizado condicional, props, estado y eventos) y los conceptos de las guías 2.3.2 y 2.3.5 y de la clase React IV (hook personalizado, mocks y rutas con MemoryRouter), y 5 complementarias (test/complementarias.spec.jsx) que verifican el CRUD del archivo de datos, el flujo de compra aprobada, todas las vistas, la conexión con producto-service (mock de la API) y el manejo de errores. Las pruebas no necesitan los microservicios encendidos: la API se simula con mocks.</w:t>
+        <w:t>El proyecto tiene 15 pruebas: 10 de defensa (test/defensa.spec.jsx), que siguen la propuesta de pruebas del Anexo 1 (renderizado correcto, renderizado condicional, props, estado y eventos) y los conceptos de las guías 2.3.2 y 2.3.5 y de la clase React IV (hook personalizado, mocks y rutas con MemoryRouter), y 5 complementarias (test/complementarias.spec.jsx) que verifican el CRUD del archivo de datos, el flujo de compra aprobada, todas las vistas, la protección contra XSS y el manejo de errores.</w:t>
       </w:r>
     </w:p>
     <w:p>
@@ -454,7 +454,7 @@
                 <w:sz w:val="19"/>
                 <w:szCs w:val="19"/>
               </w:rPr>
-              <w:t>80,4 % de sentencias en los 18 archivos que las pruebas tienen como objetivo (sección 4.2)</w:t>
+              <w:t>80,6 % de sentencias en los 18 archivos que las pruebas tienen como objetivo (sección 4.2)</w:t>
             </w:r>
           </w:p>
         </w:tc>
@@ -519,7 +519,7 @@
                 <w:sz w:val="19"/>
                 <w:szCs w:val="19"/>
               </w:rPr>
-              <w:t>66,0 % (771 de 1169) sobre todo src/</w:t>
+              <w:t>67,6 % (737 de 1091) sobre todo src/</w:t>
             </w:r>
           </w:p>
         </w:tc>
@@ -584,7 +584,7 @@
                 <w:sz w:val="19"/>
                 <w:szCs w:val="19"/>
               </w:rPr>
-              <w:t>57,2 %</w:t>
+              <w:t>59,1 %</w:t>
             </w:r>
           </w:p>
         </w:tc>
@@ -649,7 +649,7 @@
                 <w:sz w:val="19"/>
                 <w:szCs w:val="19"/>
               </w:rPr>
-              <w:t>65,9 %</w:t>
+              <w:t>69,0 %</w:t>
             </w:r>
           </w:p>
         </w:tc>
@@ -714,7 +714,7 @@
                 <w:sz w:val="19"/>
                 <w:szCs w:val="19"/>
               </w:rPr>
-              <w:t>70,1 %</w:t>
+              <w:t>71,3 %</w:t>
             </w:r>
           </w:p>
         </w:tc>
@@ -1328,22 +1328,7 @@
         <w:rPr>
           <w:rFonts w:ascii="Arial" w:cs="Arial" w:eastAsia="Arial" w:hAnsi="Arial"/>
         </w:rPr>
-        <w:t xml:space="preserve"> (datos de fábrica y microservicios simulados como apagados con </w:t>
-      </w:r>
-      <w:r>
-        <w:rPr>
-          <w:rFonts w:ascii="Consolas" w:cs="Consolas" w:eastAsia="Consolas" w:hAnsi="Consolas"/>
-          <w:sz w:val="20"/>
-          <w:szCs w:val="20"/>
-          <w:shd w:fill="EFEFEF" w:val="clear"/>
-        </w:rPr>
-        <w:t>jasmine.createSpy</w:t>
-      </w:r>
-      <w:r>
-        <w:rPr>
-          <w:rFonts w:ascii="Arial" w:cs="Arial" w:eastAsia="Arial" w:hAnsi="Arial"/>
-        </w:rPr>
-        <w:t xml:space="preserve">), </w:t>
+        <w:t xml:space="preserve"> (datos de fábrica), </w:t>
       </w:r>
       <w:r>
         <w:rPr>
@@ -1762,67 +1747,13 @@
           <w:b/>
           <w:bCs/>
         </w:rPr>
-        <w:t>Microservicios (React V):</w:t>
-      </w:r>
-      <w:r>
-        <w:rPr>
-          <w:rFonts w:ascii="Arial" w:cs="Arial" w:eastAsia="Arial" w:hAnsi="Arial"/>
-        </w:rPr>
-        <w:t xml:space="preserve"> las funciones de </w:t>
-      </w:r>
-      <w:r>
-        <w:rPr>
-          <w:rFonts w:ascii="Consolas" w:cs="Consolas" w:eastAsia="Consolas" w:hAnsi="Consolas"/>
-          <w:sz w:val="20"/>
-          <w:szCs w:val="20"/>
-          <w:shd w:fill="EFEFEF" w:val="clear"/>
-        </w:rPr>
-        <w:t>services/api.js</w:t>
-      </w:r>
-      <w:r>
-        <w:rPr>
-          <w:rFonts w:ascii="Arial" w:cs="Arial" w:eastAsia="Arial" w:hAnsi="Arial"/>
-        </w:rPr>
-        <w:t xml:space="preserve"> (axios) se reemplazan por spies. Por defecto responden "sin conexión" y la tienda usa sus datos locales; la prueba 14 hace que </w:t>
-      </w:r>
-      <w:r>
-        <w:rPr>
-          <w:rFonts w:ascii="Consolas" w:cs="Consolas" w:eastAsia="Consolas" w:hAnsi="Consolas"/>
-          <w:sz w:val="20"/>
-          <w:szCs w:val="20"/>
-          <w:shd w:fill="EFEFEF" w:val="clear"/>
-        </w:rPr>
-        <w:t>listarProductos</w:t>
-      </w:r>
-      <w:r>
-        <w:rPr>
-          <w:rFonts w:ascii="Arial" w:cs="Arial" w:eastAsia="Arial" w:hAnsi="Arial"/>
-        </w:rPr>
-        <w:t xml:space="preserve"> responda una lista controlada, como si fuera producto-service.</w:t>
-      </w:r>
-    </w:p>
-    <w:p>
-      <w:pPr>
-        <w:pStyle w:val="ListParagraph"/>
-        <w:numPr>
-          <w:ilvl w:val="0"/>
-          <w:numId w:val="2"/>
-        </w:numPr>
-        <w:spacing w:after="60" w:line="276"/>
-      </w:pPr>
-      <w:r>
-        <w:rPr>
-          <w:rFonts w:ascii="Arial" w:cs="Arial" w:eastAsia="Arial" w:hAnsi="Arial"/>
-          <w:b/>
-          <w:bCs/>
-        </w:rPr>
         <w:t>Casos inválidos y límites:</w:t>
       </w:r>
       <w:r>
         <w:rPr>
           <w:rFonts w:ascii="Arial" w:cs="Arial" w:eastAsia="Arial" w:hAnsi="Arial"/>
         </w:rPr>
-        <w:t xml:space="preserve"> se prueba lo que se rechaza (RUN con dígito incorrecto, muy corto o vacío; actualizar o eliminar un registro que no existe) y los casos de error (componente que falla, microservicio que no responde).</w:t>
+        <w:t xml:space="preserve"> se prueba lo que se rechaza (RUN con dígito incorrecto, muy corto o vacío; actualizar o eliminar un registro que no existe) y los casos de error (componente que falla, texto con código HTML).</w:t>
       </w:r>
     </w:p>
     <w:p>
@@ -4120,7 +4051,7 @@
                 <w:sz w:val="16"/>
                 <w:szCs w:val="16"/>
               </w:rPr>
-              <w:t>Catálogo desde producto-service (mock de la API)</w:t>
+              <w:t>Nombre con código HTML (XSS)</w:t>
             </w:r>
           </w:p>
         </w:tc>
@@ -4150,7 +4081,7 @@
                 <w:sz w:val="16"/>
                 <w:szCs w:val="16"/>
               </w:rPr>
-              <w:t>Mock de API (axios, React V)</w:t>
+              <w:t>Seguridad (guía 2.3.3)</w:t>
             </w:r>
           </w:p>
         </w:tc>
@@ -4180,7 +4111,7 @@
                 <w:sz w:val="16"/>
                 <w:szCs w:val="16"/>
               </w:rPr>
-              <w:t>Se llama a la API y la página muestra el diseño que respondió el microservicio y el origen de los datos.</w:t>
+              <w:t>El texto se muestra literal y no se crea ninguna etiqueta ni se ejecuta código.</w:t>
             </w:r>
           </w:p>
         </w:tc>
@@ -4211,7 +4142,7 @@
                 <w:szCs w:val="16"/>
                 <w:shd w:fill="EFEFEF" w:val="clear"/>
               </w:rPr>
-              <w:t>pages/tienda/Productos.jsx, services/api.js</w:t>
+              <w:t>moleculas/TarjetaProducto.jsx</w:t>
             </w:r>
           </w:p>
         </w:tc>
@@ -4658,7 +4589,7 @@
                 <w:sz w:val="16"/>
                 <w:szCs w:val="16"/>
               </w:rPr>
-              <w:t>52/90 (57,8 %)</w:t>
+              <w:t>42/69 (60,9 %)</w:t>
             </w:r>
           </w:p>
         </w:tc>
@@ -4688,7 +4619,7 @@
                 <w:sz w:val="16"/>
                 <w:szCs w:val="16"/>
               </w:rPr>
-              <w:t>2/16 (12,5 %)</w:t>
+              <w:t>0/6 (0,0 %)</w:t>
             </w:r>
           </w:p>
         </w:tc>
@@ -4718,7 +4649,7 @@
                 <w:sz w:val="16"/>
                 <w:szCs w:val="16"/>
               </w:rPr>
-              <w:t>22/39 (56,4 %)</w:t>
+              <w:t>17/30 (56,7 %)</w:t>
             </w:r>
           </w:p>
         </w:tc>
@@ -4748,7 +4679,7 @@
                 <w:sz w:val="16"/>
                 <w:szCs w:val="16"/>
               </w:rPr>
-              <w:t>36/65 (55,4 %)</w:t>
+              <w:t>28/49 (57,1 %)</w:t>
             </w:r>
           </w:p>
         </w:tc>
@@ -5153,7 +5084,7 @@
                 <w:sz w:val="16"/>
                 <w:szCs w:val="16"/>
               </w:rPr>
-              <w:t>56/72 (77,8 %)</w:t>
+              <w:t>57/72 (79,2 %)</w:t>
             </w:r>
           </w:p>
         </w:tc>
@@ -5278,7 +5209,7 @@
                 <w:sz w:val="16"/>
                 <w:szCs w:val="16"/>
               </w:rPr>
-              <w:t>90/141 (63,8 %)</w:t>
+              <w:t>89/139 (64,0 %)</w:t>
             </w:r>
           </w:p>
         </w:tc>
@@ -5368,7 +5299,7 @@
                 <w:sz w:val="16"/>
                 <w:szCs w:val="16"/>
               </w:rPr>
-              <w:t>82/126 (65,1 %)</w:t>
+              <w:t>81/124 (65,3 %)</w:t>
             </w:r>
           </w:p>
         </w:tc>
@@ -5713,7 +5644,7 @@
                 <w:sz w:val="16"/>
                 <w:szCs w:val="16"/>
               </w:rPr>
-              <w:t>data</w:t>
+              <w:t>config</w:t>
             </w:r>
           </w:p>
         </w:tc>
@@ -5743,7 +5674,7 @@
                 <w:sz w:val="16"/>
                 <w:szCs w:val="16"/>
               </w:rPr>
-              <w:t>75/82 (91,5 %)</w:t>
+              <w:t>6/6 (100,0 %)</w:t>
             </w:r>
           </w:p>
         </w:tc>
@@ -5773,7 +5704,7 @@
                 <w:sz w:val="16"/>
                 <w:szCs w:val="16"/>
               </w:rPr>
-              <w:t>19/27 (70,4 %)</w:t>
+              <w:t>0/0 (100,0 %)</w:t>
             </w:r>
           </w:p>
         </w:tc>
@@ -5803,7 +5734,7 @@
                 <w:sz w:val="16"/>
                 <w:szCs w:val="16"/>
               </w:rPr>
-              <w:t>26/27 (96,3 %)</w:t>
+              <w:t>0/0 (100,0 %)</w:t>
             </w:r>
           </w:p>
         </w:tc>
@@ -5833,7 +5764,7 @@
                 <w:sz w:val="16"/>
                 <w:szCs w:val="16"/>
               </w:rPr>
-              <w:t>62/68 (91,2 %)</w:t>
+              <w:t>6/6 (100,0 %)</w:t>
             </w:r>
           </w:p>
         </w:tc>
@@ -5868,7 +5799,7 @@
                 <w:sz w:val="16"/>
                 <w:szCs w:val="16"/>
               </w:rPr>
-              <w:t>pages/admin</w:t>
+              <w:t>data</w:t>
             </w:r>
           </w:p>
         </w:tc>
@@ -5898,7 +5829,7 @@
                 <w:sz w:val="16"/>
                 <w:szCs w:val="16"/>
               </w:rPr>
-              <w:t>74/138 (53,6 %)</w:t>
+              <w:t>69/76 (90,8 %)</w:t>
             </w:r>
           </w:p>
         </w:tc>
@@ -5928,7 +5859,7 @@
                 <w:sz w:val="16"/>
                 <w:szCs w:val="16"/>
               </w:rPr>
-              <w:t>58/114 (50,9 %)</w:t>
+              <w:t>19/27 (70,4 %)</w:t>
             </w:r>
           </w:p>
         </w:tc>
@@ -5958,7 +5889,7 @@
                 <w:sz w:val="16"/>
                 <w:szCs w:val="16"/>
               </w:rPr>
-              <w:t>25/48 (52,1 %)</w:t>
+              <w:t>26/27 (96,3 %)</w:t>
             </w:r>
           </w:p>
         </w:tc>
@@ -5988,7 +5919,7 @@
                 <w:sz w:val="16"/>
                 <w:szCs w:val="16"/>
               </w:rPr>
-              <w:t>71/125 (56,8 %)</w:t>
+              <w:t>56/62 (90,3 %)</w:t>
             </w:r>
           </w:p>
         </w:tc>
@@ -6023,7 +5954,7 @@
                 <w:sz w:val="16"/>
                 <w:szCs w:val="16"/>
               </w:rPr>
-              <w:t>pages/tienda</w:t>
+              <w:t>hooks</w:t>
             </w:r>
           </w:p>
         </w:tc>
@@ -6053,7 +5984,7 @@
                 <w:sz w:val="16"/>
                 <w:szCs w:val="16"/>
               </w:rPr>
-              <w:t>117/171 (68,4 %)</w:t>
+              <w:t>22/28 (78,6 %)</w:t>
             </w:r>
           </w:p>
         </w:tc>
@@ -6083,7 +6014,7 @@
                 <w:sz w:val="16"/>
                 <w:szCs w:val="16"/>
               </w:rPr>
-              <w:t>50/87 (57,5 %)</w:t>
+              <w:t>5/7 (71,4 %)</w:t>
             </w:r>
           </w:p>
         </w:tc>
@@ -6113,7 +6044,7 @@
                 <w:sz w:val="16"/>
                 <w:szCs w:val="16"/>
               </w:rPr>
-              <w:t>39/57 (68,4 %)</w:t>
+              <w:t>7/10 (70,0 %)</w:t>
             </w:r>
           </w:p>
         </w:tc>
@@ -6143,7 +6074,7 @@
                 <w:sz w:val="16"/>
                 <w:szCs w:val="16"/>
               </w:rPr>
-              <w:t>114/160 (71,2 %)</w:t>
+              <w:t>19/24 (79,2 %)</w:t>
             </w:r>
           </w:p>
         </w:tc>
@@ -6178,7 +6109,7 @@
                 <w:sz w:val="16"/>
                 <w:szCs w:val="16"/>
               </w:rPr>
-              <w:t>services</w:t>
+              <w:t>pages/admin</w:t>
             </w:r>
           </w:p>
         </w:tc>
@@ -6208,7 +6139,7 @@
                 <w:sz w:val="16"/>
                 <w:szCs w:val="16"/>
               </w:rPr>
-              <w:t>157/288 (54,5 %)</w:t>
+              <w:t>74/138 (53,6 %)</w:t>
             </w:r>
           </w:p>
         </w:tc>
@@ -6238,7 +6169,7 @@
                 <w:sz w:val="16"/>
                 <w:szCs w:val="16"/>
               </w:rPr>
-              <w:t>68/201 (33,8 %)</w:t>
+              <w:t>58/114 (50,9 %)</w:t>
             </w:r>
           </w:p>
         </w:tc>
@@ -6268,7 +6199,7 @@
                 <w:sz w:val="16"/>
                 <w:szCs w:val="16"/>
               </w:rPr>
-              <w:t>78/137 (56,9 %)</w:t>
+              <w:t>25/48 (52,1 %)</w:t>
             </w:r>
           </w:p>
         </w:tc>
@@ -6298,7 +6229,7 @@
                 <w:sz w:val="16"/>
                 <w:szCs w:val="16"/>
               </w:rPr>
-              <w:t>139/229 (60,7 %)</w:t>
+              <w:t>71/125 (56,8 %)</w:t>
             </w:r>
           </w:p>
         </w:tc>
@@ -6333,7 +6264,7 @@
                 <w:sz w:val="16"/>
                 <w:szCs w:val="16"/>
               </w:rPr>
-              <w:t>utils</w:t>
+              <w:t>pages/tienda</w:t>
             </w:r>
           </w:p>
         </w:tc>
@@ -6363,7 +6294,7 @@
                 <w:sz w:val="16"/>
                 <w:szCs w:val="16"/>
               </w:rPr>
-              <w:t>146/189 (77,2 %)</w:t>
+              <w:t>105/154 (68,2 %)</w:t>
             </w:r>
           </w:p>
         </w:tc>
@@ -6393,7 +6324,7 @@
                 <w:sz w:val="16"/>
                 <w:szCs w:val="16"/>
               </w:rPr>
-              <w:t>129/194 (66,5 %)</w:t>
+              <w:t>45/78 (57,7 %)</w:t>
             </w:r>
           </w:p>
         </w:tc>
@@ -6423,7 +6354,7 @@
                 <w:sz w:val="16"/>
                 <w:szCs w:val="16"/>
               </w:rPr>
-              <w:t>32/38 (84,2 %)</w:t>
+              <w:t>33/50 (66,0 %)</w:t>
             </w:r>
           </w:p>
         </w:tc>
@@ -6453,7 +6384,7 @@
                 <w:sz w:val="16"/>
                 <w:szCs w:val="16"/>
               </w:rPr>
-              <w:t>129/148 (87,2 %)</w:t>
+              <w:t>103/145 (71,0 %)</w:t>
             </w:r>
           </w:p>
         </w:tc>
@@ -6488,6 +6419,316 @@
                 <w:sz w:val="16"/>
                 <w:szCs w:val="16"/>
               </w:rPr>
+              <w:t>services</w:t>
+            </w:r>
+          </w:p>
+        </w:tc>
+        <w:tc>
+          <w:tcPr>
+            <w:tcW w:type="dxa" w:w="1760"/>
+            <w:tcBorders>
+              <w:top w:val="single" w:color="BFBFBF" w:sz="4"/>
+              <w:left w:val="single" w:color="BFBFBF" w:sz="4"/>
+              <w:bottom w:val="single" w:color="BFBFBF" w:sz="4"/>
+              <w:right w:val="single" w:color="BFBFBF" w:sz="4"/>
+            </w:tcBorders>
+            <w:tcMar>
+              <w:top w:type="dxa" w:w="60"/>
+              <w:left w:type="dxa" w:w="100"/>
+              <w:bottom w:type="dxa" w:w="60"/>
+              <w:right w:type="dxa" w:w="100"/>
+            </w:tcMar>
+          </w:tcPr>
+          <w:p>
+            <w:pPr>
+              <w:spacing w:after="20" w:line="252"/>
+            </w:pPr>
+            <w:r>
+              <w:rPr>
+                <w:rFonts w:ascii="Arial" w:cs="Arial" w:eastAsia="Arial" w:hAnsi="Arial"/>
+                <w:sz w:val="16"/>
+                <w:szCs w:val="16"/>
+              </w:rPr>
+              <w:t>146/250 (58,4 %)</w:t>
+            </w:r>
+          </w:p>
+        </w:tc>
+        <w:tc>
+          <w:tcPr>
+            <w:tcW w:type="dxa" w:w="1760"/>
+            <w:tcBorders>
+              <w:top w:val="single" w:color="BFBFBF" w:sz="4"/>
+              <w:left w:val="single" w:color="BFBFBF" w:sz="4"/>
+              <w:bottom w:val="single" w:color="BFBFBF" w:sz="4"/>
+              <w:right w:val="single" w:color="BFBFBF" w:sz="4"/>
+            </w:tcBorders>
+            <w:tcMar>
+              <w:top w:type="dxa" w:w="60"/>
+              <w:left w:type="dxa" w:w="100"/>
+              <w:bottom w:type="dxa" w:w="60"/>
+              <w:right w:type="dxa" w:w="100"/>
+            </w:tcMar>
+          </w:tcPr>
+          <w:p>
+            <w:pPr>
+              <w:spacing w:after="20" w:line="252"/>
+            </w:pPr>
+            <w:r>
+              <w:rPr>
+                <w:rFonts w:ascii="Arial" w:cs="Arial" w:eastAsia="Arial" w:hAnsi="Arial"/>
+                <w:sz w:val="16"/>
+                <w:szCs w:val="16"/>
+              </w:rPr>
+              <w:t>66/178 (37,1 %)</w:t>
+            </w:r>
+          </w:p>
+        </w:tc>
+        <w:tc>
+          <w:tcPr>
+            <w:tcW w:type="dxa" w:w="1760"/>
+            <w:tcBorders>
+              <w:top w:val="single" w:color="BFBFBF" w:sz="4"/>
+              <w:left w:val="single" w:color="BFBFBF" w:sz="4"/>
+              <w:bottom w:val="single" w:color="BFBFBF" w:sz="4"/>
+              <w:right w:val="single" w:color="BFBFBF" w:sz="4"/>
+            </w:tcBorders>
+            <w:tcMar>
+              <w:top w:type="dxa" w:w="60"/>
+              <w:left w:type="dxa" w:w="100"/>
+              <w:bottom w:type="dxa" w:w="60"/>
+              <w:right w:type="dxa" w:w="100"/>
+            </w:tcMar>
+          </w:tcPr>
+          <w:p>
+            <w:pPr>
+              <w:spacing w:after="20" w:line="252"/>
+            </w:pPr>
+            <w:r>
+              <w:rPr>
+                <w:rFonts w:ascii="Arial" w:cs="Arial" w:eastAsia="Arial" w:hAnsi="Arial"/>
+                <w:sz w:val="16"/>
+                <w:szCs w:val="16"/>
+              </w:rPr>
+              <w:t>77/116 (66,4 %)</w:t>
+            </w:r>
+          </w:p>
+        </w:tc>
+        <w:tc>
+          <w:tcPr>
+            <w:tcW w:type="dxa" w:w="1780"/>
+            <w:tcBorders>
+              <w:top w:val="single" w:color="BFBFBF" w:sz="4"/>
+              <w:left w:val="single" w:color="BFBFBF" w:sz="4"/>
+              <w:bottom w:val="single" w:color="BFBFBF" w:sz="4"/>
+              <w:right w:val="single" w:color="BFBFBF" w:sz="4"/>
+            </w:tcBorders>
+            <w:tcMar>
+              <w:top w:type="dxa" w:w="60"/>
+              <w:left w:type="dxa" w:w="100"/>
+              <w:bottom w:type="dxa" w:w="60"/>
+              <w:right w:type="dxa" w:w="100"/>
+            </w:tcMar>
+          </w:tcPr>
+          <w:p>
+            <w:pPr>
+              <w:spacing w:after="20" w:line="252"/>
+            </w:pPr>
+            <w:r>
+              <w:rPr>
+                <w:rFonts w:ascii="Arial" w:cs="Arial" w:eastAsia="Arial" w:hAnsi="Arial"/>
+                <w:sz w:val="16"/>
+                <w:szCs w:val="16"/>
+              </w:rPr>
+              <w:t>128/202 (63,4 %)</w:t>
+            </w:r>
+          </w:p>
+        </w:tc>
+      </w:tr>
+      <w:tr>
+        <w:trPr>
+          <w:cantSplit/>
+        </w:trPr>
+        <w:tc>
+          <w:tcPr>
+            <w:tcW w:type="dxa" w:w="2300"/>
+            <w:tcBorders>
+              <w:top w:val="single" w:color="BFBFBF" w:sz="4"/>
+              <w:left w:val="single" w:color="BFBFBF" w:sz="4"/>
+              <w:bottom w:val="single" w:color="BFBFBF" w:sz="4"/>
+              <w:right w:val="single" w:color="BFBFBF" w:sz="4"/>
+            </w:tcBorders>
+            <w:tcMar>
+              <w:top w:type="dxa" w:w="60"/>
+              <w:left w:type="dxa" w:w="100"/>
+              <w:bottom w:type="dxa" w:w="60"/>
+              <w:right w:type="dxa" w:w="100"/>
+            </w:tcMar>
+          </w:tcPr>
+          <w:p>
+            <w:pPr>
+              <w:spacing w:after="20" w:line="252"/>
+            </w:pPr>
+            <w:r>
+              <w:rPr>
+                <w:rFonts w:ascii="Arial" w:cs="Arial" w:eastAsia="Arial" w:hAnsi="Arial"/>
+                <w:sz w:val="16"/>
+                <w:szCs w:val="16"/>
+              </w:rPr>
+              <w:t>utils</w:t>
+            </w:r>
+          </w:p>
+        </w:tc>
+        <w:tc>
+          <w:tcPr>
+            <w:tcW w:type="dxa" w:w="1760"/>
+            <w:tcBorders>
+              <w:top w:val="single" w:color="BFBFBF" w:sz="4"/>
+              <w:left w:val="single" w:color="BFBFBF" w:sz="4"/>
+              <w:bottom w:val="single" w:color="BFBFBF" w:sz="4"/>
+              <w:right w:val="single" w:color="BFBFBF" w:sz="4"/>
+            </w:tcBorders>
+            <w:tcMar>
+              <w:top w:type="dxa" w:w="60"/>
+              <w:left w:type="dxa" w:w="100"/>
+              <w:bottom w:type="dxa" w:w="60"/>
+              <w:right w:type="dxa" w:w="100"/>
+            </w:tcMar>
+          </w:tcPr>
+          <w:p>
+            <w:pPr>
+              <w:spacing w:after="20" w:line="252"/>
+            </w:pPr>
+            <w:r>
+              <w:rPr>
+                <w:rFonts w:ascii="Arial" w:cs="Arial" w:eastAsia="Arial" w:hAnsi="Arial"/>
+                <w:sz w:val="16"/>
+                <w:szCs w:val="16"/>
+              </w:rPr>
+              <w:t>124/161 (77,0 %)</w:t>
+            </w:r>
+          </w:p>
+        </w:tc>
+        <w:tc>
+          <w:tcPr>
+            <w:tcW w:type="dxa" w:w="1760"/>
+            <w:tcBorders>
+              <w:top w:val="single" w:color="BFBFBF" w:sz="4"/>
+              <w:left w:val="single" w:color="BFBFBF" w:sz="4"/>
+              <w:bottom w:val="single" w:color="BFBFBF" w:sz="4"/>
+              <w:right w:val="single" w:color="BFBFBF" w:sz="4"/>
+            </w:tcBorders>
+            <w:tcMar>
+              <w:top w:type="dxa" w:w="60"/>
+              <w:left w:type="dxa" w:w="100"/>
+              <w:bottom w:type="dxa" w:w="60"/>
+              <w:right w:type="dxa" w:w="100"/>
+            </w:tcMar>
+          </w:tcPr>
+          <w:p>
+            <w:pPr>
+              <w:spacing w:after="20" w:line="252"/>
+            </w:pPr>
+            <w:r>
+              <w:rPr>
+                <w:rFonts w:ascii="Arial" w:cs="Arial" w:eastAsia="Arial" w:hAnsi="Arial"/>
+                <w:sz w:val="16"/>
+                <w:szCs w:val="16"/>
+              </w:rPr>
+              <w:t>124/187 (66,3 %)</w:t>
+            </w:r>
+          </w:p>
+        </w:tc>
+        <w:tc>
+          <w:tcPr>
+            <w:tcW w:type="dxa" w:w="1760"/>
+            <w:tcBorders>
+              <w:top w:val="single" w:color="BFBFBF" w:sz="4"/>
+              <w:left w:val="single" w:color="BFBFBF" w:sz="4"/>
+              <w:bottom w:val="single" w:color="BFBFBF" w:sz="4"/>
+              <w:right w:val="single" w:color="BFBFBF" w:sz="4"/>
+            </w:tcBorders>
+            <w:tcMar>
+              <w:top w:type="dxa" w:w="60"/>
+              <w:left w:type="dxa" w:w="100"/>
+              <w:bottom w:type="dxa" w:w="60"/>
+              <w:right w:type="dxa" w:w="100"/>
+            </w:tcMar>
+          </w:tcPr>
+          <w:p>
+            <w:pPr>
+              <w:spacing w:after="20" w:line="252"/>
+            </w:pPr>
+            <w:r>
+              <w:rPr>
+                <w:rFonts w:ascii="Arial" w:cs="Arial" w:eastAsia="Arial" w:hAnsi="Arial"/>
+                <w:sz w:val="16"/>
+                <w:szCs w:val="16"/>
+              </w:rPr>
+              <w:t>25/28 (89,3 %)</w:t>
+            </w:r>
+          </w:p>
+        </w:tc>
+        <w:tc>
+          <w:tcPr>
+            <w:tcW w:type="dxa" w:w="1780"/>
+            <w:tcBorders>
+              <w:top w:val="single" w:color="BFBFBF" w:sz="4"/>
+              <w:left w:val="single" w:color="BFBFBF" w:sz="4"/>
+              <w:bottom w:val="single" w:color="BFBFBF" w:sz="4"/>
+              <w:right w:val="single" w:color="BFBFBF" w:sz="4"/>
+            </w:tcBorders>
+            <w:tcMar>
+              <w:top w:type="dxa" w:w="60"/>
+              <w:left w:type="dxa" w:w="100"/>
+              <w:bottom w:type="dxa" w:w="60"/>
+              <w:right w:type="dxa" w:w="100"/>
+            </w:tcMar>
+          </w:tcPr>
+          <w:p>
+            <w:pPr>
+              <w:spacing w:after="20" w:line="252"/>
+            </w:pPr>
+            <w:r>
+              <w:rPr>
+                <w:rFonts w:ascii="Arial" w:cs="Arial" w:eastAsia="Arial" w:hAnsi="Arial"/>
+                <w:sz w:val="16"/>
+                <w:szCs w:val="16"/>
+              </w:rPr>
+              <w:t>110/124 (88,7 %)</w:t>
+            </w:r>
+          </w:p>
+        </w:tc>
+      </w:tr>
+      <w:tr>
+        <w:trPr>
+          <w:cantSplit/>
+        </w:trPr>
+        <w:tc>
+          <w:tcPr>
+            <w:tcW w:type="dxa" w:w="2300"/>
+            <w:tcBorders>
+              <w:top w:val="single" w:color="BFBFBF" w:sz="4"/>
+              <w:left w:val="single" w:color="BFBFBF" w:sz="4"/>
+              <w:bottom w:val="single" w:color="BFBFBF" w:sz="4"/>
+              <w:right w:val="single" w:color="BFBFBF" w:sz="4"/>
+            </w:tcBorders>
+            <w:tcMar>
+              <w:top w:type="dxa" w:w="60"/>
+              <w:left w:type="dxa" w:w="100"/>
+              <w:bottom w:type="dxa" w:w="60"/>
+              <w:right w:type="dxa" w:w="100"/>
+            </w:tcMar>
+          </w:tcPr>
+          <w:p>
+            <w:pPr>
+              <w:spacing w:after="20" w:line="252"/>
+            </w:pPr>
+            <w:r>
+              <w:rPr>
+                <w:rFonts w:ascii="Arial" w:cs="Arial" w:eastAsia="Arial" w:hAnsi="Arial"/>
+                <w:sz w:val="16"/>
+                <w:szCs w:val="16"/>
+              </w:rPr>
               <w:t>TOTAL</w:t>
             </w:r>
           </w:p>
@@ -6518,7 +6759,7 @@
                 <w:sz w:val="16"/>
                 <w:szCs w:val="16"/>
               </w:rPr>
-              <w:t>771/1169 (66,0 %)</w:t>
+              <w:t>737/1091 (67,6 %)</w:t>
             </w:r>
           </w:p>
         </w:tc>
@@ -6548,7 +6789,7 @@
                 <w:sz w:val="16"/>
                 <w:szCs w:val="16"/>
               </w:rPr>
-              <w:t>504/881 (57,2 %)</w:t>
+              <w:t>496/839 (59,1 %)</w:t>
             </w:r>
           </w:p>
         </w:tc>
@@ -6578,7 +6819,7 @@
                 <w:sz w:val="16"/>
                 <w:szCs w:val="16"/>
               </w:rPr>
-              <w:t>292/443 (65,9 %)</w:t>
+              <w:t>280/406 (69,0 %)</w:t>
             </w:r>
           </w:p>
         </w:tc>
@@ -6608,7 +6849,7 @@
                 <w:sz w:val="16"/>
                 <w:szCs w:val="16"/>
               </w:rPr>
-              <w:t>692/987 (70,1 %)</w:t>
+              <w:t>661/927 (71,3 %)</w:t>
             </w:r>
           </w:p>
         </w:tc>
@@ -7466,7 +7707,7 @@
                 <w:sz w:val="15"/>
                 <w:szCs w:val="15"/>
               </w:rPr>
-              <w:t>components/organismos/FormularioContacto.jsx</w:t>
+              <w:t>components/moleculas/TarjetaProducto.jsx</w:t>
             </w:r>
           </w:p>
         </w:tc>
@@ -7496,7 +7737,7 @@
                 <w:sz w:val="15"/>
                 <w:szCs w:val="15"/>
               </w:rPr>
-              <w:t>3/8 (37,5 %)</w:t>
+              <w:t>3/4 (75,0 %)</w:t>
             </w:r>
           </w:p>
         </w:tc>
@@ -7526,7 +7767,7 @@
                 <w:sz w:val="15"/>
                 <w:szCs w:val="15"/>
               </w:rPr>
-              <w:t>0/2 (0,0 %)</w:t>
+              <w:t>11/14 (78,6 %)</w:t>
             </w:r>
           </w:p>
         </w:tc>
@@ -7586,7 +7827,7 @@
                 <w:sz w:val="15"/>
                 <w:szCs w:val="15"/>
               </w:rPr>
-              <w:t>3/7 (42,9 %)</w:t>
+              <w:t>3/4 (75,0 %)</w:t>
             </w:r>
           </w:p>
         </w:tc>
@@ -7621,7 +7862,7 @@
                 <w:sz w:val="15"/>
                 <w:szCs w:val="15"/>
               </w:rPr>
-              <w:t>components/organismos/FormularioLogin.jsx</w:t>
+              <w:t>components/organismos/FormularioContacto.jsx</w:t>
             </w:r>
           </w:p>
         </w:tc>
@@ -7651,7 +7892,7 @@
                 <w:sz w:val="15"/>
                 <w:szCs w:val="15"/>
               </w:rPr>
-              <w:t>8/9 (88,9 %)</w:t>
+              <w:t>3/8 (37,5 %)</w:t>
             </w:r>
           </w:p>
         </w:tc>
@@ -7681,7 +7922,7 @@
                 <w:sz w:val="15"/>
                 <w:szCs w:val="15"/>
               </w:rPr>
-              <w:t>4/6 (66,7 %)</w:t>
+              <w:t>0/2 (0,0 %)</w:t>
             </w:r>
           </w:p>
         </w:tc>
@@ -7711,7 +7952,7 @@
                 <w:sz w:val="15"/>
                 <w:szCs w:val="15"/>
               </w:rPr>
-              <w:t>2/2 (100,0 %)</w:t>
+              <w:t>1/2 (50,0 %)</w:t>
             </w:r>
           </w:p>
         </w:tc>
@@ -7741,7 +7982,7 @@
                 <w:sz w:val="15"/>
                 <w:szCs w:val="15"/>
               </w:rPr>
-              <w:t>8/8 (100,0 %)</w:t>
+              <w:t>3/7 (42,9 %)</w:t>
             </w:r>
           </w:p>
         </w:tc>
@@ -7776,7 +8017,7 @@
                 <w:sz w:val="15"/>
                 <w:szCs w:val="15"/>
               </w:rPr>
-              <w:t>utils/useFormulario.js</w:t>
+              <w:t>components/organismos/FormularioLogin.jsx</w:t>
             </w:r>
           </w:p>
         </w:tc>
@@ -7806,7 +8047,7 @@
                 <w:sz w:val="15"/>
                 <w:szCs w:val="15"/>
               </w:rPr>
-              <w:t>22/28 (78,6 %)</w:t>
+              <w:t>7/8 (87,5 %)</w:t>
             </w:r>
           </w:p>
         </w:tc>
@@ -7836,7 +8077,7 @@
                 <w:sz w:val="15"/>
                 <w:szCs w:val="15"/>
               </w:rPr>
-              <w:t>5/7 (71,4 %)</w:t>
+              <w:t>4/6 (66,7 %)</w:t>
             </w:r>
           </w:p>
         </w:tc>
@@ -7866,7 +8107,7 @@
                 <w:sz w:val="15"/>
                 <w:szCs w:val="15"/>
               </w:rPr>
-              <w:t>7/10 (70,0 %)</w:t>
+              <w:t>2/2 (100,0 %)</w:t>
             </w:r>
           </w:p>
         </w:tc>
@@ -7896,7 +8137,7 @@
                 <w:sz w:val="15"/>
                 <w:szCs w:val="15"/>
               </w:rPr>
-              <w:t>19/24 (79,2 %)</w:t>
+              <w:t>7/7 (100,0 %)</w:t>
             </w:r>
           </w:p>
         </w:tc>
@@ -7931,7 +8172,7 @@
                 <w:sz w:val="15"/>
                 <w:szCs w:val="15"/>
               </w:rPr>
-              <w:t>components/utilidades/RutaProtegida.jsx</w:t>
+              <w:t>utils/useFormulario.js</w:t>
             </w:r>
           </w:p>
         </w:tc>
@@ -7961,7 +8202,7 @@
                 <w:sz w:val="15"/>
                 <w:szCs w:val="15"/>
               </w:rPr>
-              <w:t>6/6 (100,0 %)</w:t>
+              <w:t>22/28 (78,6 %)</w:t>
             </w:r>
           </w:p>
         </w:tc>
@@ -7991,7 +8232,7 @@
                 <w:sz w:val="15"/>
                 <w:szCs w:val="15"/>
               </w:rPr>
-              <w:t>7/7 (100,0 %)</w:t>
+              <w:t>5/7 (71,4 %)</w:t>
             </w:r>
           </w:p>
         </w:tc>
@@ -8021,7 +8262,7 @@
                 <w:sz w:val="15"/>
                 <w:szCs w:val="15"/>
               </w:rPr>
-              <w:t>1/1 (100,0 %)</w:t>
+              <w:t>7/10 (70,0 %)</w:t>
             </w:r>
           </w:p>
         </w:tc>
@@ -8051,7 +8292,7 @@
                 <w:sz w:val="15"/>
                 <w:szCs w:val="15"/>
               </w:rPr>
-              <w:t>6/6 (100,0 %)</w:t>
+              <w:t>19/24 (79,2 %)</w:t>
             </w:r>
           </w:p>
         </w:tc>
@@ -8086,7 +8327,7 @@
                 <w:sz w:val="15"/>
                 <w:szCs w:val="15"/>
               </w:rPr>
-              <w:t>components/utilidades/LimiteDeErrores.jsx</w:t>
+              <w:t>components/utilidades/RutaProtegida.jsx</w:t>
             </w:r>
           </w:p>
         </w:tc>
@@ -8116,7 +8357,7 @@
                 <w:sz w:val="15"/>
                 <w:szCs w:val="15"/>
               </w:rPr>
-              <w:t>7/7 (100,0 %)</w:t>
+              <w:t>6/6 (100,0 %)</w:t>
             </w:r>
           </w:p>
         </w:tc>
@@ -8146,7 +8387,7 @@
                 <w:sz w:val="15"/>
                 <w:szCs w:val="15"/>
               </w:rPr>
-              <w:t>4/4 (100,0 %)</w:t>
+              <w:t>7/7 (100,0 %)</w:t>
             </w:r>
           </w:p>
         </w:tc>
@@ -8176,7 +8417,7 @@
                 <w:sz w:val="15"/>
                 <w:szCs w:val="15"/>
               </w:rPr>
-              <w:t>4/4 (100,0 %)</w:t>
+              <w:t>1/1 (100,0 %)</w:t>
             </w:r>
           </w:p>
         </w:tc>
@@ -8206,7 +8447,7 @@
                 <w:sz w:val="15"/>
                 <w:szCs w:val="15"/>
               </w:rPr>
-              <w:t>7/7 (100,0 %)</w:t>
+              <w:t>6/6 (100,0 %)</w:t>
             </w:r>
           </w:p>
         </w:tc>
@@ -8241,7 +8482,7 @@
                 <w:sz w:val="15"/>
                 <w:szCs w:val="15"/>
               </w:rPr>
-              <w:t>utils/validaciones.js</w:t>
+              <w:t>components/utilidades/LimiteDeErrores.jsx</w:t>
             </w:r>
           </w:p>
         </w:tc>
@@ -8271,7 +8512,7 @@
                 <w:sz w:val="15"/>
                 <w:szCs w:val="15"/>
               </w:rPr>
-              <w:t>98/129 (76,0 %)</w:t>
+              <w:t>7/7 (100,0 %)</w:t>
             </w:r>
           </w:p>
         </w:tc>
@@ -8301,7 +8542,7 @@
                 <w:sz w:val="15"/>
                 <w:szCs w:val="15"/>
               </w:rPr>
-              <w:t>112/164 (68,3 %)</w:t>
+              <w:t>4/4 (100,0 %)</w:t>
             </w:r>
           </w:p>
         </w:tc>
@@ -8331,7 +8572,7 @@
                 <w:sz w:val="15"/>
                 <w:szCs w:val="15"/>
               </w:rPr>
-              <w:t>16/18 (88,9 %)</w:t>
+              <w:t>4/4 (100,0 %)</w:t>
             </w:r>
           </w:p>
         </w:tc>
@@ -8361,7 +8602,7 @@
                 <w:sz w:val="15"/>
                 <w:szCs w:val="15"/>
               </w:rPr>
-              <w:t>84/96 (87,5 %)</w:t>
+              <w:t>7/7 (100,0 %)</w:t>
             </w:r>
           </w:p>
         </w:tc>
@@ -8396,7 +8637,7 @@
                 <w:sz w:val="15"/>
                 <w:szCs w:val="15"/>
               </w:rPr>
-              <w:t>data/db.js</w:t>
+              <w:t>utils/validaciones.js</w:t>
             </w:r>
           </w:p>
         </w:tc>
@@ -8426,7 +8667,7 @@
                 <w:sz w:val="15"/>
                 <w:szCs w:val="15"/>
               </w:rPr>
-              <w:t>42/49 (85,7 %)</w:t>
+              <w:t>98/129 (76,0 %)</w:t>
             </w:r>
           </w:p>
         </w:tc>
@@ -8456,7 +8697,7 @@
                 <w:sz w:val="15"/>
                 <w:szCs w:val="15"/>
               </w:rPr>
-              <w:t>12/18 (66,7 %)</w:t>
+              <w:t>112/164 (68,3 %)</w:t>
             </w:r>
           </w:p>
         </w:tc>
@@ -8486,7 +8727,7 @@
                 <w:sz w:val="15"/>
                 <w:szCs w:val="15"/>
               </w:rPr>
-              <w:t>14/15 (93,3 %)</w:t>
+              <w:t>16/18 (88,9 %)</w:t>
             </w:r>
           </w:p>
         </w:tc>
@@ -8516,7 +8757,7 @@
                 <w:sz w:val="15"/>
                 <w:szCs w:val="15"/>
               </w:rPr>
-              <w:t>35/41 (85,4 %)</w:t>
+              <w:t>84/96 (87,5 %)</w:t>
             </w:r>
           </w:p>
         </w:tc>
@@ -8551,7 +8792,7 @@
                 <w:sz w:val="15"/>
                 <w:szCs w:val="15"/>
               </w:rPr>
-              <w:t>pages/tienda/Checkout.jsx</w:t>
+              <w:t>data/db.js</w:t>
             </w:r>
           </w:p>
         </w:tc>
@@ -8581,7 +8822,7 @@
                 <w:sz w:val="15"/>
                 <w:szCs w:val="15"/>
               </w:rPr>
-              <w:t>32/36 (88,9 %)</w:t>
+              <w:t>42/49 (85,7 %)</w:t>
             </w:r>
           </w:p>
         </w:tc>
@@ -8611,7 +8852,7 @@
                 <w:sz w:val="15"/>
                 <w:szCs w:val="15"/>
               </w:rPr>
-              <w:t>25/32 (78,1 %)</w:t>
+              <w:t>12/18 (66,7 %)</w:t>
             </w:r>
           </w:p>
         </w:tc>
@@ -8641,7 +8882,7 @@
                 <w:sz w:val="15"/>
                 <w:szCs w:val="15"/>
               </w:rPr>
-              <w:t>7/7 (100,0 %)</w:t>
+              <w:t>14/15 (93,3 %)</w:t>
             </w:r>
           </w:p>
         </w:tc>
@@ -8671,7 +8912,7 @@
                 <w:sz w:val="15"/>
                 <w:szCs w:val="15"/>
               </w:rPr>
-              <w:t>30/33 (90,9 %)</w:t>
+              <w:t>35/41 (85,4 %)</w:t>
             </w:r>
           </w:p>
         </w:tc>
@@ -8706,7 +8947,7 @@
                 <w:sz w:val="15"/>
                 <w:szCs w:val="15"/>
               </w:rPr>
-              <w:t>components/organismos/FormularioCheckout.jsx</w:t>
+              <w:t>pages/tienda/Checkout.jsx</w:t>
             </w:r>
           </w:p>
         </w:tc>
@@ -8736,7 +8977,7 @@
                 <w:sz w:val="15"/>
                 <w:szCs w:val="15"/>
               </w:rPr>
-              <w:t>25/26 (96,2 %)</w:t>
+              <w:t>32/36 (88,9 %)</w:t>
             </w:r>
           </w:p>
         </w:tc>
@@ -8766,7 +9007,7 @@
                 <w:sz w:val="15"/>
                 <w:szCs w:val="15"/>
               </w:rPr>
-              <w:t>18/22 (81,8 %)</w:t>
+              <w:t>25/32 (78,1 %)</w:t>
             </w:r>
           </w:p>
         </w:tc>
@@ -8796,7 +9037,7 @@
                 <w:sz w:val="15"/>
                 <w:szCs w:val="15"/>
               </w:rPr>
-              <w:t>11/11 (100,0 %)</w:t>
+              <w:t>7/7 (100,0 %)</w:t>
             </w:r>
           </w:p>
         </w:tc>
@@ -8826,7 +9067,7 @@
                 <w:sz w:val="15"/>
                 <w:szCs w:val="15"/>
               </w:rPr>
-              <w:t>19/19 (100,0 %)</w:t>
+              <w:t>30/33 (90,9 %)</w:t>
             </w:r>
           </w:p>
         </w:tc>
@@ -8861,7 +9102,7 @@
                 <w:sz w:val="15"/>
                 <w:szCs w:val="15"/>
               </w:rPr>
-              <w:t>services/ordenesService.js</w:t>
+              <w:t>components/organismos/FormularioCheckout.jsx</w:t>
             </w:r>
           </w:p>
         </w:tc>
@@ -8891,7 +9132,7 @@
                 <w:sz w:val="15"/>
                 <w:szCs w:val="15"/>
               </w:rPr>
-              <w:t>20/24 (83,3 %)</w:t>
+              <w:t>25/26 (96,2 %)</w:t>
             </w:r>
           </w:p>
         </w:tc>
@@ -8921,7 +9162,7 @@
                 <w:sz w:val="15"/>
                 <w:szCs w:val="15"/>
               </w:rPr>
-              <w:t>10/13 (76,9 %)</w:t>
+              <w:t>18/22 (81,8 %)</w:t>
             </w:r>
           </w:p>
         </w:tc>
@@ -8951,7 +9192,7 @@
                 <w:sz w:val="15"/>
                 <w:szCs w:val="15"/>
               </w:rPr>
-              <w:t>14/17 (82,4 %)</w:t>
+              <w:t>11/11 (100,0 %)</w:t>
             </w:r>
           </w:p>
         </w:tc>
@@ -8981,7 +9222,7 @@
                 <w:sz w:val="15"/>
                 <w:szCs w:val="15"/>
               </w:rPr>
-              <w:t>17/19 (89,5 %)</w:t>
+              <w:t>19/19 (100,0 %)</w:t>
             </w:r>
           </w:p>
         </w:tc>
@@ -9016,7 +9257,7 @@
                 <w:sz w:val="15"/>
                 <w:szCs w:val="15"/>
               </w:rPr>
-              <w:t>services/carritoService.js</w:t>
+              <w:t>services/ordenesService.js</w:t>
             </w:r>
           </w:p>
         </w:tc>
@@ -9046,7 +9287,7 @@
                 <w:sz w:val="15"/>
                 <w:szCs w:val="15"/>
               </w:rPr>
-              <w:t>32/44 (72,7 %)</w:t>
+              <w:t>20/24 (83,3 %)</w:t>
             </w:r>
           </w:p>
         </w:tc>
@@ -9076,7 +9317,7 @@
                 <w:sz w:val="15"/>
                 <w:szCs w:val="15"/>
               </w:rPr>
-              <w:t>13/21 (61,9 %)</w:t>
+              <w:t>10/13 (76,9 %)</w:t>
             </w:r>
           </w:p>
         </w:tc>
@@ -9106,7 +9347,7 @@
                 <w:sz w:val="15"/>
                 <w:szCs w:val="15"/>
               </w:rPr>
-              <w:t>12/16 (75,0 %)</w:t>
+              <w:t>14/17 (82,4 %)</w:t>
             </w:r>
           </w:p>
         </w:tc>
@@ -9136,7 +9377,7 @@
                 <w:sz w:val="15"/>
                 <w:szCs w:val="15"/>
               </w:rPr>
-              <w:t>29/39 (74,4 %)</w:t>
+              <w:t>17/19 (89,5 %)</w:t>
             </w:r>
           </w:p>
         </w:tc>
@@ -9171,7 +9412,7 @@
                 <w:sz w:val="15"/>
                 <w:szCs w:val="15"/>
               </w:rPr>
-              <w:t>pages/tienda/CompraExitosa.jsx</w:t>
+              <w:t>services/carritoService.js</w:t>
             </w:r>
           </w:p>
         </w:tc>
@@ -9201,7 +9442,7 @@
                 <w:sz w:val="15"/>
                 <w:szCs w:val="15"/>
               </w:rPr>
-              <w:t>4/6 (66,7 %)</w:t>
+              <w:t>25/36 (69,4 %)</w:t>
             </w:r>
           </w:p>
         </w:tc>
@@ -9231,7 +9472,7 @@
                 <w:sz w:val="15"/>
                 <w:szCs w:val="15"/>
               </w:rPr>
-              <w:t>3/4 (75,0 %)</w:t>
+              <w:t>11/19 (57,9 %)</w:t>
             </w:r>
           </w:p>
         </w:tc>
@@ -9261,7 +9502,7 @@
                 <w:sz w:val="15"/>
                 <w:szCs w:val="15"/>
               </w:rPr>
-              <w:t>1/2 (50,0 %)</w:t>
+              <w:t>11/15 (73,3 %)</w:t>
             </w:r>
           </w:p>
         </w:tc>
@@ -9291,7 +9532,7 @@
                 <w:sz w:val="15"/>
                 <w:szCs w:val="15"/>
               </w:rPr>
-              <w:t>4/6 (66,7 %)</w:t>
+              <w:t>22/31 (71,0 %)</w:t>
             </w:r>
           </w:p>
         </w:tc>
@@ -9326,7 +9567,7 @@
                 <w:sz w:val="15"/>
                 <w:szCs w:val="15"/>
               </w:rPr>
-              <w:t>components/organismos/Boleta.jsx</w:t>
+              <w:t>pages/tienda/CompraExitosa.jsx</w:t>
             </w:r>
           </w:p>
         </w:tc>
@@ -9356,7 +9597,7 @@
                 <w:sz w:val="15"/>
                 <w:szCs w:val="15"/>
               </w:rPr>
-              <w:t>3/3 (100,0 %)</w:t>
+              <w:t>4/6 (66,7 %)</w:t>
             </w:r>
           </w:p>
         </w:tc>
@@ -9416,7 +9657,7 @@
                 <w:sz w:val="15"/>
                 <w:szCs w:val="15"/>
               </w:rPr>
-              <w:t>2/2 (100,0 %)</w:t>
+              <w:t>1/2 (50,0 %)</w:t>
             </w:r>
           </w:p>
         </w:tc>
@@ -9446,7 +9687,7 @@
                 <w:sz w:val="15"/>
                 <w:szCs w:val="15"/>
               </w:rPr>
-              <w:t>3/3 (100,0 %)</w:t>
+              <w:t>4/6 (66,7 %)</w:t>
             </w:r>
           </w:p>
         </w:tc>
@@ -9481,7 +9722,7 @@
                 <w:sz w:val="15"/>
                 <w:szCs w:val="15"/>
               </w:rPr>
-              <w:t>pages/tienda/Productos.jsx</w:t>
+              <w:t>components/organismos/Boleta.jsx</w:t>
             </w:r>
           </w:p>
         </w:tc>
@@ -9511,7 +9752,7 @@
                 <w:sz w:val="15"/>
                 <w:szCs w:val="15"/>
               </w:rPr>
-              <w:t>19/26 (73,1 %)</w:t>
+              <w:t>3/3 (100,0 %)</w:t>
             </w:r>
           </w:p>
         </w:tc>
@@ -9541,7 +9782,7 @@
                 <w:sz w:val="15"/>
                 <w:szCs w:val="15"/>
               </w:rPr>
-              <w:t>5/6 (83,3 %)</w:t>
+              <w:t>3/4 (75,0 %)</w:t>
             </w:r>
           </w:p>
         </w:tc>
@@ -9571,7 +9812,7 @@
                 <w:sz w:val="15"/>
                 <w:szCs w:val="15"/>
               </w:rPr>
-              <w:t>5/9 (55,6 %)</w:t>
+              <w:t>2/2 (100,0 %)</w:t>
             </w:r>
           </w:p>
         </w:tc>
@@ -9601,7 +9842,7 @@
                 <w:sz w:val="15"/>
                 <w:szCs w:val="15"/>
               </w:rPr>
-              <w:t>18/22 (81,8 %)</w:t>
+              <w:t>3/3 (100,0 %)</w:t>
             </w:r>
           </w:p>
         </w:tc>
@@ -9666,7 +9907,7 @@
                 <w:sz w:val="15"/>
                 <w:szCs w:val="15"/>
               </w:rPr>
-              <w:t>336/418 (80,4 %)</w:t>
+              <w:t>312/387 (80,6 %)</w:t>
             </w:r>
           </w:p>
         </w:tc>
@@ -9696,7 +9937,7 @@
                 <w:sz w:val="15"/>
                 <w:szCs w:val="15"/>
               </w:rPr>
-              <w:t>253/349 (72,5 %)</w:t>
+              <w:t>257/355 (72,4 %)</w:t>
             </w:r>
           </w:p>
         </w:tc>
@@ -9726,7 +9967,7 @@
                 <w:sz w:val="15"/>
                 <w:szCs w:val="15"/>
               </w:rPr>
-              <w:t>104/123 (84,6 %)</w:t>
+              <w:t>99/115 (86,1 %)</w:t>
             </w:r>
           </w:p>
         </w:tc>
@@ -9756,7 +9997,7 @@
                 <w:sz w:val="15"/>
                 <w:szCs w:val="15"/>
               </w:rPr>
-              <w:t>296/345 (85,8 %)</w:t>
+              <w:t>273/318 (85,8 %)</w:t>
             </w:r>
           </w:p>
         </w:tc>
@@ -9787,7 +10028,7 @@
         <w:rPr>
           <w:rFonts w:ascii="Arial" w:cs="Arial" w:eastAsia="Arial" w:hAnsi="Arial"/>
         </w:rPr>
-        <w:t>Cómo leer las cifras (material 2.3.4): sentencias y líneas indican qué parte del código se ejecutó; ramas indica cuántos caminos de los if, ternarios y &amp;&amp; se recorrieron; funciones, cuántas funciones se llamaron al menos una vez. La cobertura global es de 66,0 % de sentencias, 57,2 % de ramas, 65,9 % de funciones y 70,1 % de líneas, con solo 15 pruebas.</w:t>
+        <w:t>Cómo leer las cifras (material 2.3.4): sentencias y líneas indican qué parte del código se ejecutó; ramas indica cuántos caminos de los if, ternarios y &amp;&amp; se recorrieron; funciones, cuántas funciones se llamaron al menos una vez. La cobertura global es de 67,6 % de sentencias, 59,1 % de ramas, 69,0 % de funciones y 71,3 % de líneas, con solo 15 pruebas.</w:t>
       </w:r>
     </w:p>
     <w:p>
@@ -9819,7 +10060,7 @@
         <w:rPr>
           <w:rFonts w:ascii="Arial" w:cs="Arial" w:eastAsia="Arial" w:hAnsi="Arial"/>
         </w:rPr>
-        <w:t>En los 18 archivos objetivo la cobertura sube a 80,4 % de sentencias y 85,8 % de líneas. Lo que queda sin ejecutar son ramas alternativas: por ejemplo, el envío del formulario de contacto (la prueba 4 solo verifica el estado al escribir) o la lista vacía en ListaProductos.</w:t>
+        <w:t>En los 18 archivos objetivo la cobertura sube a 80,6 % de sentencias y 85,8 % de líneas. Lo que queda sin ejecutar son ramas alternativas: por ejemplo, el envío del formulario de contacto (la prueba 4 solo verifica el estado al escribir) o la lista vacía en ListaProductos.</w:t>
       </w:r>
     </w:p>
     <w:p>
@@ -9835,7 +10076,7 @@
         <w:rPr>
           <w:rFonts w:ascii="Arial" w:cs="Arial" w:eastAsia="Arial" w:hAnsi="Arial"/>
         </w:rPr>
-        <w:t>Las ramas más bajas están en services (33,8 %) y pages/admin (50,9 %): son caminos de error poco frecuentes (cupos agotados al pagar, almacenamiento bloqueado), las respuestas de error de los microservicios y ediciones desde el panel. Las vistas del panel sí se dibujan (prueba 13), pero sus formularios de edición no se envían en las pruebas.</w:t>
+        <w:t>Las ramas más bajas están en services (37,1 %) y pages/admin (50,9 %): son caminos de error poco frecuentes (cupos agotados al pagar, almacenamiento bloqueado) y ediciones desde el panel. Las vistas del panel sí se dibujan (prueba 13), pero sus formularios de edición no se envían en las pruebas.</w:t>
       </w:r>
     </w:p>
     <w:p>
@@ -9879,7 +10120,7 @@
         <w:rPr>
           <w:rFonts w:ascii="Arial" w:cs="Arial" w:eastAsia="Arial" w:hAnsi="Arial"/>
         </w:rPr>
-        <w:t>Las reglas críticas del negocio están verificadas: RUN, pago rechazado y aprobado, descuento de cupos, hora ocupada solo al pagar y control de acceso por rol. También se comprobó que el catálogo muestra lo que responde producto-service y que el Error Boundary evita la pantalla en blanco.</w:t>
+        <w:t>Las reglas críticas del negocio están verificadas: RUN, pago rechazado y aprobado, descuento de cupos, hora ocupada solo al pagar y control de acceso por rol. También se comprobó que React escapa el texto (XSS) y que el Error Boundary evita la pantalla en blanco.</w:t>
       </w:r>
     </w:p>
     <w:p>

</xml_diff>

<commit_message>
Estética manga y catálogo nuevo: 5 estilos con 5 diseños originales cada uno
- tema.css con estilo manga: trama de puntos, tarjetas como viñetas con borde grueso
  y sombra dura, portada con líneas de velocidad, acento rojo y Dela Gothic One.
- Estilos: Kawaii, Anime, Tribal Y2K, Celestial y Cybersigilism (25 diseños).
  Todas las ilustraciones son originales, con su vista a escala en el cuerpo.
- Textos del estudio, tatuadores, blog, Nosotros y portada actualizados.
- Base simulada v3 para que el navegador cargue el catálogo nuevo.
- 15 de 15 pruebas; README, ERS, guía, plan y documento de cobertura actualizados.

Co-Authored-By: Claude Opus 5.5 <noreply@anthropic.com>
Claude-Session: https://claude.ai/code/session_01Pt6gjuLf4CGXtN9zPMw67H
</commit_message>
<xml_diff>
--- a/docs/Cobertura_Testing_ForeverInk.docx
+++ b/docs/Cobertura_Testing_ForeverInk.docx
@@ -584,7 +584,7 @@
                 <w:sz w:val="19"/>
                 <w:szCs w:val="19"/>
               </w:rPr>
-              <w:t>59,1 %</w:t>
+              <w:t>59,2 %</w:t>
             </w:r>
           </w:p>
         </w:tc>
@@ -5084,7 +5084,7 @@
                 <w:sz w:val="16"/>
                 <w:szCs w:val="16"/>
               </w:rPr>
-              <w:t>57/72 (79,2 %)</w:t>
+              <w:t>59/74 (79,7 %)</w:t>
             </w:r>
           </w:p>
         </w:tc>
@@ -5644,7 +5644,7 @@
                 <w:sz w:val="16"/>
                 <w:szCs w:val="16"/>
               </w:rPr>
-              <w:t>config</w:t>
+              <w:t>data</w:t>
             </w:r>
           </w:p>
         </w:tc>
@@ -5674,7 +5674,7 @@
                 <w:sz w:val="16"/>
                 <w:szCs w:val="16"/>
               </w:rPr>
-              <w:t>6/6 (100,0 %)</w:t>
+              <w:t>75/82 (91,5 %)</w:t>
             </w:r>
           </w:p>
         </w:tc>
@@ -5704,7 +5704,7 @@
                 <w:sz w:val="16"/>
                 <w:szCs w:val="16"/>
               </w:rPr>
-              <w:t>0/0 (100,0 %)</w:t>
+              <w:t>19/27 (70,4 %)</w:t>
             </w:r>
           </w:p>
         </w:tc>
@@ -5734,7 +5734,7 @@
                 <w:sz w:val="16"/>
                 <w:szCs w:val="16"/>
               </w:rPr>
-              <w:t>0/0 (100,0 %)</w:t>
+              <w:t>26/27 (96,3 %)</w:t>
             </w:r>
           </w:p>
         </w:tc>
@@ -5764,7 +5764,7 @@
                 <w:sz w:val="16"/>
                 <w:szCs w:val="16"/>
               </w:rPr>
-              <w:t>6/6 (100,0 %)</w:t>
+              <w:t>62/68 (91,2 %)</w:t>
             </w:r>
           </w:p>
         </w:tc>
@@ -5799,7 +5799,7 @@
                 <w:sz w:val="16"/>
                 <w:szCs w:val="16"/>
               </w:rPr>
-              <w:t>data</w:t>
+              <w:t>pages/admin</w:t>
             </w:r>
           </w:p>
         </w:tc>
@@ -5829,7 +5829,7 @@
                 <w:sz w:val="16"/>
                 <w:szCs w:val="16"/>
               </w:rPr>
-              <w:t>69/76 (90,8 %)</w:t>
+              <w:t>74/138 (53,6 %)</w:t>
             </w:r>
           </w:p>
         </w:tc>
@@ -5859,7 +5859,7 @@
                 <w:sz w:val="16"/>
                 <w:szCs w:val="16"/>
               </w:rPr>
-              <w:t>19/27 (70,4 %)</w:t>
+              <w:t>58/114 (50,9 %)</w:t>
             </w:r>
           </w:p>
         </w:tc>
@@ -5889,7 +5889,7 @@
                 <w:sz w:val="16"/>
                 <w:szCs w:val="16"/>
               </w:rPr>
-              <w:t>26/27 (96,3 %)</w:t>
+              <w:t>25/48 (52,1 %)</w:t>
             </w:r>
           </w:p>
         </w:tc>
@@ -5919,7 +5919,7 @@
                 <w:sz w:val="16"/>
                 <w:szCs w:val="16"/>
               </w:rPr>
-              <w:t>56/62 (90,3 %)</w:t>
+              <w:t>71/125 (56,8 %)</w:t>
             </w:r>
           </w:p>
         </w:tc>
@@ -5954,7 +5954,7 @@
                 <w:sz w:val="16"/>
                 <w:szCs w:val="16"/>
               </w:rPr>
-              <w:t>hooks</w:t>
+              <w:t>pages/tienda</w:t>
             </w:r>
           </w:p>
         </w:tc>
@@ -5984,7 +5984,7 @@
                 <w:sz w:val="16"/>
                 <w:szCs w:val="16"/>
               </w:rPr>
-              <w:t>22/28 (78,6 %)</w:t>
+              <w:t>105/154 (68,2 %)</w:t>
             </w:r>
           </w:p>
         </w:tc>
@@ -6014,7 +6014,7 @@
                 <w:sz w:val="16"/>
                 <w:szCs w:val="16"/>
               </w:rPr>
-              <w:t>5/7 (71,4 %)</w:t>
+              <w:t>45/78 (57,7 %)</w:t>
             </w:r>
           </w:p>
         </w:tc>
@@ -6044,7 +6044,7 @@
                 <w:sz w:val="16"/>
                 <w:szCs w:val="16"/>
               </w:rPr>
-              <w:t>7/10 (70,0 %)</w:t>
+              <w:t>33/50 (66,0 %)</w:t>
             </w:r>
           </w:p>
         </w:tc>
@@ -6074,7 +6074,7 @@
                 <w:sz w:val="16"/>
                 <w:szCs w:val="16"/>
               </w:rPr>
-              <w:t>19/24 (79,2 %)</w:t>
+              <w:t>103/145 (71,0 %)</w:t>
             </w:r>
           </w:p>
         </w:tc>
@@ -6109,7 +6109,7 @@
                 <w:sz w:val="16"/>
                 <w:szCs w:val="16"/>
               </w:rPr>
-              <w:t>pages/admin</w:t>
+              <w:t>services</w:t>
             </w:r>
           </w:p>
         </w:tc>
@@ -6139,7 +6139,7 @@
                 <w:sz w:val="16"/>
                 <w:szCs w:val="16"/>
               </w:rPr>
-              <w:t>74/138 (53,6 %)</w:t>
+              <w:t>146/250 (58,4 %)</w:t>
             </w:r>
           </w:p>
         </w:tc>
@@ -6169,7 +6169,7 @@
                 <w:sz w:val="16"/>
                 <w:szCs w:val="16"/>
               </w:rPr>
-              <w:t>58/114 (50,9 %)</w:t>
+              <w:t>66/178 (37,1 %)</w:t>
             </w:r>
           </w:p>
         </w:tc>
@@ -6199,7 +6199,7 @@
                 <w:sz w:val="16"/>
                 <w:szCs w:val="16"/>
               </w:rPr>
-              <w:t>25/48 (52,1 %)</w:t>
+              <w:t>77/116 (66,4 %)</w:t>
             </w:r>
           </w:p>
         </w:tc>
@@ -6229,7 +6229,7 @@
                 <w:sz w:val="16"/>
                 <w:szCs w:val="16"/>
               </w:rPr>
-              <w:t>71/125 (56,8 %)</w:t>
+              <w:t>128/202 (63,4 %)</w:t>
             </w:r>
           </w:p>
         </w:tc>
@@ -6264,7 +6264,7 @@
                 <w:sz w:val="16"/>
                 <w:szCs w:val="16"/>
               </w:rPr>
-              <w:t>pages/tienda</w:t>
+              <w:t>utils</w:t>
             </w:r>
           </w:p>
         </w:tc>
@@ -6294,7 +6294,7 @@
                 <w:sz w:val="16"/>
                 <w:szCs w:val="16"/>
               </w:rPr>
-              <w:t>105/154 (68,2 %)</w:t>
+              <w:t>146/189 (77,2 %)</w:t>
             </w:r>
           </w:p>
         </w:tc>
@@ -6324,7 +6324,7 @@
                 <w:sz w:val="16"/>
                 <w:szCs w:val="16"/>
               </w:rPr>
-              <w:t>45/78 (57,7 %)</w:t>
+              <w:t>129/194 (66,5 %)</w:t>
             </w:r>
           </w:p>
         </w:tc>
@@ -6354,7 +6354,7 @@
                 <w:sz w:val="16"/>
                 <w:szCs w:val="16"/>
               </w:rPr>
-              <w:t>33/50 (66,0 %)</w:t>
+              <w:t>32/38 (84,2 %)</w:t>
             </w:r>
           </w:p>
         </w:tc>
@@ -6384,7 +6384,7 @@
                 <w:sz w:val="16"/>
                 <w:szCs w:val="16"/>
               </w:rPr>
-              <w:t>103/145 (71,0 %)</w:t>
+              <w:t>129/148 (87,2 %)</w:t>
             </w:r>
           </w:p>
         </w:tc>
@@ -6419,7 +6419,7 @@
                 <w:sz w:val="16"/>
                 <w:szCs w:val="16"/>
               </w:rPr>
-              <w:t>services</w:t>
+              <w:t>TOTAL</w:t>
             </w:r>
           </w:p>
         </w:tc>
@@ -6449,7 +6449,7 @@
                 <w:sz w:val="16"/>
                 <w:szCs w:val="16"/>
               </w:rPr>
-              <w:t>146/250 (58,4 %)</w:t>
+              <w:t>737/1091 (67,6 %)</w:t>
             </w:r>
           </w:p>
         </w:tc>
@@ -6479,317 +6479,7 @@
                 <w:sz w:val="16"/>
                 <w:szCs w:val="16"/>
               </w:rPr>
-              <w:t>66/178 (37,1 %)</w:t>
-            </w:r>
-          </w:p>
-        </w:tc>
-        <w:tc>
-          <w:tcPr>
-            <w:tcW w:type="dxa" w:w="1760"/>
-            <w:tcBorders>
-              <w:top w:val="single" w:color="BFBFBF" w:sz="4"/>
-              <w:left w:val="single" w:color="BFBFBF" w:sz="4"/>
-              <w:bottom w:val="single" w:color="BFBFBF" w:sz="4"/>
-              <w:right w:val="single" w:color="BFBFBF" w:sz="4"/>
-            </w:tcBorders>
-            <w:tcMar>
-              <w:top w:type="dxa" w:w="60"/>
-              <w:left w:type="dxa" w:w="100"/>
-              <w:bottom w:type="dxa" w:w="60"/>
-              <w:right w:type="dxa" w:w="100"/>
-            </w:tcMar>
-          </w:tcPr>
-          <w:p>
-            <w:pPr>
-              <w:spacing w:after="20" w:line="252"/>
-            </w:pPr>
-            <w:r>
-              <w:rPr>
-                <w:rFonts w:ascii="Arial" w:cs="Arial" w:eastAsia="Arial" w:hAnsi="Arial"/>
-                <w:sz w:val="16"/>
-                <w:szCs w:val="16"/>
-              </w:rPr>
-              <w:t>77/116 (66,4 %)</w:t>
-            </w:r>
-          </w:p>
-        </w:tc>
-        <w:tc>
-          <w:tcPr>
-            <w:tcW w:type="dxa" w:w="1780"/>
-            <w:tcBorders>
-              <w:top w:val="single" w:color="BFBFBF" w:sz="4"/>
-              <w:left w:val="single" w:color="BFBFBF" w:sz="4"/>
-              <w:bottom w:val="single" w:color="BFBFBF" w:sz="4"/>
-              <w:right w:val="single" w:color="BFBFBF" w:sz="4"/>
-            </w:tcBorders>
-            <w:tcMar>
-              <w:top w:type="dxa" w:w="60"/>
-              <w:left w:type="dxa" w:w="100"/>
-              <w:bottom w:type="dxa" w:w="60"/>
-              <w:right w:type="dxa" w:w="100"/>
-            </w:tcMar>
-          </w:tcPr>
-          <w:p>
-            <w:pPr>
-              <w:spacing w:after="20" w:line="252"/>
-            </w:pPr>
-            <w:r>
-              <w:rPr>
-                <w:rFonts w:ascii="Arial" w:cs="Arial" w:eastAsia="Arial" w:hAnsi="Arial"/>
-                <w:sz w:val="16"/>
-                <w:szCs w:val="16"/>
-              </w:rPr>
-              <w:t>128/202 (63,4 %)</w:t>
-            </w:r>
-          </w:p>
-        </w:tc>
-      </w:tr>
-      <w:tr>
-        <w:trPr>
-          <w:cantSplit/>
-        </w:trPr>
-        <w:tc>
-          <w:tcPr>
-            <w:tcW w:type="dxa" w:w="2300"/>
-            <w:tcBorders>
-              <w:top w:val="single" w:color="BFBFBF" w:sz="4"/>
-              <w:left w:val="single" w:color="BFBFBF" w:sz="4"/>
-              <w:bottom w:val="single" w:color="BFBFBF" w:sz="4"/>
-              <w:right w:val="single" w:color="BFBFBF" w:sz="4"/>
-            </w:tcBorders>
-            <w:tcMar>
-              <w:top w:type="dxa" w:w="60"/>
-              <w:left w:type="dxa" w:w="100"/>
-              <w:bottom w:type="dxa" w:w="60"/>
-              <w:right w:type="dxa" w:w="100"/>
-            </w:tcMar>
-          </w:tcPr>
-          <w:p>
-            <w:pPr>
-              <w:spacing w:after="20" w:line="252"/>
-            </w:pPr>
-            <w:r>
-              <w:rPr>
-                <w:rFonts w:ascii="Arial" w:cs="Arial" w:eastAsia="Arial" w:hAnsi="Arial"/>
-                <w:sz w:val="16"/>
-                <w:szCs w:val="16"/>
-              </w:rPr>
-              <w:t>utils</w:t>
-            </w:r>
-          </w:p>
-        </w:tc>
-        <w:tc>
-          <w:tcPr>
-            <w:tcW w:type="dxa" w:w="1760"/>
-            <w:tcBorders>
-              <w:top w:val="single" w:color="BFBFBF" w:sz="4"/>
-              <w:left w:val="single" w:color="BFBFBF" w:sz="4"/>
-              <w:bottom w:val="single" w:color="BFBFBF" w:sz="4"/>
-              <w:right w:val="single" w:color="BFBFBF" w:sz="4"/>
-            </w:tcBorders>
-            <w:tcMar>
-              <w:top w:type="dxa" w:w="60"/>
-              <w:left w:type="dxa" w:w="100"/>
-              <w:bottom w:type="dxa" w:w="60"/>
-              <w:right w:type="dxa" w:w="100"/>
-            </w:tcMar>
-          </w:tcPr>
-          <w:p>
-            <w:pPr>
-              <w:spacing w:after="20" w:line="252"/>
-            </w:pPr>
-            <w:r>
-              <w:rPr>
-                <w:rFonts w:ascii="Arial" w:cs="Arial" w:eastAsia="Arial" w:hAnsi="Arial"/>
-                <w:sz w:val="16"/>
-                <w:szCs w:val="16"/>
-              </w:rPr>
-              <w:t>124/161 (77,0 %)</w:t>
-            </w:r>
-          </w:p>
-        </w:tc>
-        <w:tc>
-          <w:tcPr>
-            <w:tcW w:type="dxa" w:w="1760"/>
-            <w:tcBorders>
-              <w:top w:val="single" w:color="BFBFBF" w:sz="4"/>
-              <w:left w:val="single" w:color="BFBFBF" w:sz="4"/>
-              <w:bottom w:val="single" w:color="BFBFBF" w:sz="4"/>
-              <w:right w:val="single" w:color="BFBFBF" w:sz="4"/>
-            </w:tcBorders>
-            <w:tcMar>
-              <w:top w:type="dxa" w:w="60"/>
-              <w:left w:type="dxa" w:w="100"/>
-              <w:bottom w:type="dxa" w:w="60"/>
-              <w:right w:type="dxa" w:w="100"/>
-            </w:tcMar>
-          </w:tcPr>
-          <w:p>
-            <w:pPr>
-              <w:spacing w:after="20" w:line="252"/>
-            </w:pPr>
-            <w:r>
-              <w:rPr>
-                <w:rFonts w:ascii="Arial" w:cs="Arial" w:eastAsia="Arial" w:hAnsi="Arial"/>
-                <w:sz w:val="16"/>
-                <w:szCs w:val="16"/>
-              </w:rPr>
-              <w:t>124/187 (66,3 %)</w:t>
-            </w:r>
-          </w:p>
-        </w:tc>
-        <w:tc>
-          <w:tcPr>
-            <w:tcW w:type="dxa" w:w="1760"/>
-            <w:tcBorders>
-              <w:top w:val="single" w:color="BFBFBF" w:sz="4"/>
-              <w:left w:val="single" w:color="BFBFBF" w:sz="4"/>
-              <w:bottom w:val="single" w:color="BFBFBF" w:sz="4"/>
-              <w:right w:val="single" w:color="BFBFBF" w:sz="4"/>
-            </w:tcBorders>
-            <w:tcMar>
-              <w:top w:type="dxa" w:w="60"/>
-              <w:left w:type="dxa" w:w="100"/>
-              <w:bottom w:type="dxa" w:w="60"/>
-              <w:right w:type="dxa" w:w="100"/>
-            </w:tcMar>
-          </w:tcPr>
-          <w:p>
-            <w:pPr>
-              <w:spacing w:after="20" w:line="252"/>
-            </w:pPr>
-            <w:r>
-              <w:rPr>
-                <w:rFonts w:ascii="Arial" w:cs="Arial" w:eastAsia="Arial" w:hAnsi="Arial"/>
-                <w:sz w:val="16"/>
-                <w:szCs w:val="16"/>
-              </w:rPr>
-              <w:t>25/28 (89,3 %)</w:t>
-            </w:r>
-          </w:p>
-        </w:tc>
-        <w:tc>
-          <w:tcPr>
-            <w:tcW w:type="dxa" w:w="1780"/>
-            <w:tcBorders>
-              <w:top w:val="single" w:color="BFBFBF" w:sz="4"/>
-              <w:left w:val="single" w:color="BFBFBF" w:sz="4"/>
-              <w:bottom w:val="single" w:color="BFBFBF" w:sz="4"/>
-              <w:right w:val="single" w:color="BFBFBF" w:sz="4"/>
-            </w:tcBorders>
-            <w:tcMar>
-              <w:top w:type="dxa" w:w="60"/>
-              <w:left w:type="dxa" w:w="100"/>
-              <w:bottom w:type="dxa" w:w="60"/>
-              <w:right w:type="dxa" w:w="100"/>
-            </w:tcMar>
-          </w:tcPr>
-          <w:p>
-            <w:pPr>
-              <w:spacing w:after="20" w:line="252"/>
-            </w:pPr>
-            <w:r>
-              <w:rPr>
-                <w:rFonts w:ascii="Arial" w:cs="Arial" w:eastAsia="Arial" w:hAnsi="Arial"/>
-                <w:sz w:val="16"/>
-                <w:szCs w:val="16"/>
-              </w:rPr>
-              <w:t>110/124 (88,7 %)</w:t>
-            </w:r>
-          </w:p>
-        </w:tc>
-      </w:tr>
-      <w:tr>
-        <w:trPr>
-          <w:cantSplit/>
-        </w:trPr>
-        <w:tc>
-          <w:tcPr>
-            <w:tcW w:type="dxa" w:w="2300"/>
-            <w:tcBorders>
-              <w:top w:val="single" w:color="BFBFBF" w:sz="4"/>
-              <w:left w:val="single" w:color="BFBFBF" w:sz="4"/>
-              <w:bottom w:val="single" w:color="BFBFBF" w:sz="4"/>
-              <w:right w:val="single" w:color="BFBFBF" w:sz="4"/>
-            </w:tcBorders>
-            <w:tcMar>
-              <w:top w:type="dxa" w:w="60"/>
-              <w:left w:type="dxa" w:w="100"/>
-              <w:bottom w:type="dxa" w:w="60"/>
-              <w:right w:type="dxa" w:w="100"/>
-            </w:tcMar>
-          </w:tcPr>
-          <w:p>
-            <w:pPr>
-              <w:spacing w:after="20" w:line="252"/>
-            </w:pPr>
-            <w:r>
-              <w:rPr>
-                <w:rFonts w:ascii="Arial" w:cs="Arial" w:eastAsia="Arial" w:hAnsi="Arial"/>
-                <w:sz w:val="16"/>
-                <w:szCs w:val="16"/>
-              </w:rPr>
-              <w:t>TOTAL</w:t>
-            </w:r>
-          </w:p>
-        </w:tc>
-        <w:tc>
-          <w:tcPr>
-            <w:tcW w:type="dxa" w:w="1760"/>
-            <w:tcBorders>
-              <w:top w:val="single" w:color="BFBFBF" w:sz="4"/>
-              <w:left w:val="single" w:color="BFBFBF" w:sz="4"/>
-              <w:bottom w:val="single" w:color="BFBFBF" w:sz="4"/>
-              <w:right w:val="single" w:color="BFBFBF" w:sz="4"/>
-            </w:tcBorders>
-            <w:tcMar>
-              <w:top w:type="dxa" w:w="60"/>
-              <w:left w:type="dxa" w:w="100"/>
-              <w:bottom w:type="dxa" w:w="60"/>
-              <w:right w:type="dxa" w:w="100"/>
-            </w:tcMar>
-          </w:tcPr>
-          <w:p>
-            <w:pPr>
-              <w:spacing w:after="20" w:line="252"/>
-            </w:pPr>
-            <w:r>
-              <w:rPr>
-                <w:rFonts w:ascii="Arial" w:cs="Arial" w:eastAsia="Arial" w:hAnsi="Arial"/>
-                <w:sz w:val="16"/>
-                <w:szCs w:val="16"/>
-              </w:rPr>
-              <w:t>737/1091 (67,6 %)</w:t>
-            </w:r>
-          </w:p>
-        </w:tc>
-        <w:tc>
-          <w:tcPr>
-            <w:tcW w:type="dxa" w:w="1760"/>
-            <w:tcBorders>
-              <w:top w:val="single" w:color="BFBFBF" w:sz="4"/>
-              <w:left w:val="single" w:color="BFBFBF" w:sz="4"/>
-              <w:bottom w:val="single" w:color="BFBFBF" w:sz="4"/>
-              <w:right w:val="single" w:color="BFBFBF" w:sz="4"/>
-            </w:tcBorders>
-            <w:tcMar>
-              <w:top w:type="dxa" w:w="60"/>
-              <w:left w:type="dxa" w:w="100"/>
-              <w:bottom w:type="dxa" w:w="60"/>
-              <w:right w:type="dxa" w:w="100"/>
-            </w:tcMar>
-          </w:tcPr>
-          <w:p>
-            <w:pPr>
-              <w:spacing w:after="20" w:line="252"/>
-            </w:pPr>
-            <w:r>
-              <w:rPr>
-                <w:rFonts w:ascii="Arial" w:cs="Arial" w:eastAsia="Arial" w:hAnsi="Arial"/>
-                <w:sz w:val="16"/>
-                <w:szCs w:val="16"/>
-              </w:rPr>
-              <w:t>496/839 (59,1 %)</w:t>
+              <w:t>498/841 (59,2 %)</w:t>
             </w:r>
           </w:p>
         </w:tc>
@@ -7767,7 +7457,7 @@
                 <w:sz w:val="15"/>
                 <w:szCs w:val="15"/>
               </w:rPr>
-              <w:t>11/14 (78,6 %)</w:t>
+              <w:t>13/16 (81,2 %)</w:t>
             </w:r>
           </w:p>
         </w:tc>
@@ -9937,7 +9627,7 @@
                 <w:sz w:val="15"/>
                 <w:szCs w:val="15"/>
               </w:rPr>
-              <w:t>257/355 (72,4 %)</w:t>
+              <w:t>259/357 (72,5 %)</w:t>
             </w:r>
           </w:p>
         </w:tc>
@@ -10028,7 +9718,7 @@
         <w:rPr>
           <w:rFonts w:ascii="Arial" w:cs="Arial" w:eastAsia="Arial" w:hAnsi="Arial"/>
         </w:rPr>
-        <w:t>Cómo leer las cifras (material 2.3.4): sentencias y líneas indican qué parte del código se ejecutó; ramas indica cuántos caminos de los if, ternarios y &amp;&amp; se recorrieron; funciones, cuántas funciones se llamaron al menos una vez. La cobertura global es de 67,6 % de sentencias, 59,1 % de ramas, 69,0 % de funciones y 71,3 % de líneas, con solo 15 pruebas.</w:t>
+        <w:t>Cómo leer las cifras (material 2.3.4): sentencias y líneas indican qué parte del código se ejecutó; ramas indica cuántos caminos de los if, ternarios y &amp;&amp; se recorrieron; funciones, cuántas funciones se llamaron al menos una vez. La cobertura global es de 67,6 % de sentencias, 59,2 % de ramas, 69,0 % de funciones y 71,3 % de líneas, con solo 15 pruebas.</w:t>
       </w:r>
     </w:p>
     <w:p>

</xml_diff>

<commit_message>
Nosotros con nuestro equipo, precios según tamaño y sin tatuador por diseño
- Nosotros: se quita "Desarrollo del sitio"; "Nuestro equipo" muestra a Isabel
  Cántaro, Eduardo Caro y Yeremi Vásquez (todos tatúan todos los estilos).
- Cada diseño deja de tener tatuador asignado (detalle, panel y formulario de
  producto); el tatuador se sigue eligiendo al agendar en el checkout.
- Precios ajustados al tamaño: piezas pequeñas desde $25.000.
- Documentos con las cifras de cobertura actualizadas (15 de 15 pruebas).

Co-Authored-By: Claude Opus 5.5 <noreply@anthropic.com>
Claude-Session: https://claude.ai/code/session_01Pt6gjuLf4CGXtN9zPMw67H
</commit_message>
<xml_diff>
--- a/docs/Cobertura_Testing_ForeverInk.docx
+++ b/docs/Cobertura_Testing_ForeverInk.docx
@@ -519,7 +519,7 @@
                 <w:sz w:val="19"/>
                 <w:szCs w:val="19"/>
               </w:rPr>
-              <w:t>67,6 % (737 de 1091) sobre todo src/</w:t>
+              <w:t>67,5 % (734 de 1088) sobre todo src/</w:t>
             </w:r>
           </w:p>
         </w:tc>
@@ -649,7 +649,7 @@
                 <w:sz w:val="19"/>
                 <w:szCs w:val="19"/>
               </w:rPr>
-              <w:t>69,0 %</w:t>
+              <w:t>68,8 %</w:t>
             </w:r>
           </w:p>
         </w:tc>
@@ -714,7 +714,7 @@
                 <w:sz w:val="19"/>
                 <w:szCs w:val="19"/>
               </w:rPr>
-              <w:t>71,3 %</w:t>
+              <w:t>71,2 %</w:t>
             </w:r>
           </w:p>
         </w:tc>
@@ -5209,7 +5209,7 @@
                 <w:sz w:val="16"/>
                 <w:szCs w:val="16"/>
               </w:rPr>
-              <w:t>89/139 (64,0 %)</w:t>
+              <w:t>88/138 (63,8 %)</w:t>
             </w:r>
           </w:p>
         </w:tc>
@@ -5239,7 +5239,7 @@
                 <w:sz w:val="16"/>
                 <w:szCs w:val="16"/>
               </w:rPr>
-              <w:t>93/140 (66,4 %)</w:t>
+              <w:t>92/138 (66,7 %)</w:t>
             </w:r>
           </w:p>
         </w:tc>
@@ -5269,7 +5269,7 @@
                 <w:sz w:val="16"/>
                 <w:szCs w:val="16"/>
               </w:rPr>
-              <w:t>40/64 (62,5 %)</w:t>
+              <w:t>39/63 (61,9 %)</w:t>
             </w:r>
           </w:p>
         </w:tc>
@@ -5299,7 +5299,7 @@
                 <w:sz w:val="16"/>
                 <w:szCs w:val="16"/>
               </w:rPr>
-              <w:t>81/124 (65,3 %)</w:t>
+              <w:t>80/123 (65,0 %)</w:t>
             </w:r>
           </w:p>
         </w:tc>
@@ -5674,7 +5674,7 @@
                 <w:sz w:val="16"/>
                 <w:szCs w:val="16"/>
               </w:rPr>
-              <w:t>75/82 (91,5 %)</w:t>
+              <w:t>74/81 (91,4 %)</w:t>
             </w:r>
           </w:p>
         </w:tc>
@@ -5764,7 +5764,7 @@
                 <w:sz w:val="16"/>
                 <w:szCs w:val="16"/>
               </w:rPr>
-              <w:t>62/68 (91,2 %)</w:t>
+              <w:t>61/67 (91,0 %)</w:t>
             </w:r>
           </w:p>
         </w:tc>
@@ -5984,7 +5984,7 @@
                 <w:sz w:val="16"/>
                 <w:szCs w:val="16"/>
               </w:rPr>
-              <w:t>105/154 (68,2 %)</w:t>
+              <w:t>104/153 (68,0 %)</w:t>
             </w:r>
           </w:p>
         </w:tc>
@@ -6044,7 +6044,7 @@
                 <w:sz w:val="16"/>
                 <w:szCs w:val="16"/>
               </w:rPr>
-              <w:t>33/50 (66,0 %)</w:t>
+              <w:t>32/49 (65,3 %)</w:t>
             </w:r>
           </w:p>
         </w:tc>
@@ -6074,7 +6074,7 @@
                 <w:sz w:val="16"/>
                 <w:szCs w:val="16"/>
               </w:rPr>
-              <w:t>103/145 (71,0 %)</w:t>
+              <w:t>102/144 (70,8 %)</w:t>
             </w:r>
           </w:p>
         </w:tc>
@@ -6449,7 +6449,7 @@
                 <w:sz w:val="16"/>
                 <w:szCs w:val="16"/>
               </w:rPr>
-              <w:t>737/1091 (67,6 %)</w:t>
+              <w:t>734/1088 (67,5 %)</w:t>
             </w:r>
           </w:p>
         </w:tc>
@@ -6479,7 +6479,7 @@
                 <w:sz w:val="16"/>
                 <w:szCs w:val="16"/>
               </w:rPr>
-              <w:t>498/841 (59,2 %)</w:t>
+              <w:t>497/839 (59,2 %)</w:t>
             </w:r>
           </w:p>
         </w:tc>
@@ -6509,7 +6509,7 @@
                 <w:sz w:val="16"/>
                 <w:szCs w:val="16"/>
               </w:rPr>
-              <w:t>280/406 (69,0 %)</w:t>
+              <w:t>278/404 (68,8 %)</w:t>
             </w:r>
           </w:p>
         </w:tc>
@@ -6539,7 +6539,7 @@
                 <w:sz w:val="16"/>
                 <w:szCs w:val="16"/>
               </w:rPr>
-              <w:t>661/927 (71,3 %)</w:t>
+              <w:t>658/924 (71,2 %)</w:t>
             </w:r>
           </w:p>
         </w:tc>
@@ -9718,7 +9718,7 @@
         <w:rPr>
           <w:rFonts w:ascii="Arial" w:cs="Arial" w:eastAsia="Arial" w:hAnsi="Arial"/>
         </w:rPr>
-        <w:t>Cómo leer las cifras (material 2.3.4): sentencias y líneas indican qué parte del código se ejecutó; ramas indica cuántos caminos de los if, ternarios y &amp;&amp; se recorrieron; funciones, cuántas funciones se llamaron al menos una vez. La cobertura global es de 67,6 % de sentencias, 59,2 % de ramas, 69,0 % de funciones y 71,3 % de líneas, con solo 15 pruebas.</w:t>
+        <w:t>Cómo leer las cifras (material 2.3.4): sentencias y líneas indican qué parte del código se ejecutó; ramas indica cuántos caminos de los if, ternarios y &amp;&amp; se recorrieron; funciones, cuántas funciones se llamaron al menos una vez. La cobertura global es de 67,5 % de sentencias, 59,2 % de ramas, 68,8 % de funciones y 71,2 % de líneas, con solo 15 pruebas.</w:t>
       </w:r>
     </w:p>
     <w:p>

</xml_diff>